<commit_message>
fix import excel bug
</commit_message>
<xml_diff>
--- a/SistemBeritaAcara.Web/wwwroot/files/documents/ba-1-draft.docx
+++ b/SistemBeritaAcara.Web/wwwroot/files/documents/ba-1-draft.docx
@@ -15,6 +15,7 @@
           <w:insideV w:val="none" w:color="auto" w:sz="0" w:space="0"/>
         </w:tblBorders>
         <w:tblLook w:val="04A0" w:firstRow="1" w:lastRow="0" w:firstColumn="1" w:lastColumn="0" w:noHBand="0" w:noVBand="1"/>
+        <w:tblLayout w:type="fixed"/>
       </w:tblPr>
       <w:tblGrid>
         <w:gridCol w:w="1755"/>
@@ -37,13 +38,13 @@
                 <w:noProof/>
               </w:rPr>
               <w:drawing>
-                <wp:anchor distT="0" distB="0" distL="114300" distR="114300" simplePos="0" relativeHeight="251659264" behindDoc="0" locked="0" layoutInCell="1" allowOverlap="1" wp14:editId="1D0A44B9" wp14:anchorId="7FA3F3CE">
+                <wp:anchor distT="0" distB="0" distL="114300" distR="114300" simplePos="0" relativeHeight="251659264" behindDoc="0" locked="0" layoutInCell="1" allowOverlap="1" wp14:editId="7BDD633D" wp14:anchorId="27E6B33E">
                   <wp:simplePos x="0" y="0"/>
                   <wp:positionH relativeFrom="column">
-                    <wp:posOffset>-174625</wp:posOffset>
+                    <wp:posOffset>-183125</wp:posOffset>
                   </wp:positionH>
                   <wp:positionV relativeFrom="paragraph">
-                    <wp:posOffset>-93980</wp:posOffset>
+                    <wp:posOffset>-89535</wp:posOffset>
                   </wp:positionV>
                   <wp:extent cx="1186249" cy="348488"/>
                   <wp:effectExtent l="0" t="0" r="0" b="0"/>
@@ -163,43 +164,26 @@
           </w:p>
           <w:p>
             <w:pPr>
-              <w:spacing w:line="276" w:lineRule="auto"/>
               <w:jc w:val="center"/>
-              <w:rPr>
-                <w:lang w:val="nb-NO"/>
-              </w:rPr>
-            </w:pPr>
-            <w:r>
-              <w:t xml:space="preserve">Gd. Wisma </w:t>
+            </w:pPr>
+            <w:r>
+              <w:t xml:space="preserve">Jl. </w:t>
             </w:r>
             <w:proofErr w:type="spellStart"/>
             <w:r>
-              <w:t>Tugu</w:t>
+              <w:t>Jenderal</w:t>
             </w:r>
             <w:proofErr w:type="spellEnd"/>
             <w:r>
-              <w:t xml:space="preserve"> II Lt. 2 Jl. </w:t>
-            </w:r>
-            <w:r>
-              <w:rPr>
-                <w:lang w:val="nb-NO"/>
-              </w:rPr>
-              <w:t>HR Rasuna</w:t>
-            </w:r>
-          </w:p>
-          <w:p>
-            <w:pPr>
-              <w:spacing w:line="276" w:lineRule="auto"/>
+              <w:t xml:space="preserve"> Ahmad Yani </w:t>
+            </w:r>
+          </w:p>
+          <w:p>
+            <w:pPr>
               <w:jc w:val="center"/>
-              <w:rPr>
-                <w:lang w:val="nb-NO"/>
-              </w:rPr>
-            </w:pPr>
-            <w:r>
-              <w:rPr>
-                <w:lang w:val="nb-NO"/>
-              </w:rPr>
-              <w:t>Said Kav. C 7-9 Kuningan, Jakarta</w:t>
+            </w:pPr>
+            <w:r>
+              <w:t xml:space="preserve">No. 1247, Kel. 14 Ulu, </w:t>
             </w:r>
           </w:p>
           <w:p>
@@ -213,7 +197,21 @@
               <w:rPr>
                 <w:lang w:val="nb-NO"/>
               </w:rPr>
-              <w:t>12290, Indonesia</w:t>
+              <w:t>Kec. Seberang Ulu II,</w:t>
+            </w:r>
+          </w:p>
+          <w:p>
+            <w:pPr>
+              <w:jc w:val="center"/>
+              <w:rPr>
+                <w:lang w:val="nb-NO"/>
+              </w:rPr>
+            </w:pPr>
+            <w:r>
+              <w:rPr>
+                <w:lang w:val="nb-NO"/>
+              </w:rPr>
+              <w:t>Kota Palembang</w:t>
             </w:r>
           </w:p>
           <w:p>
@@ -242,20 +240,20 @@
               <w:tblStyle w:val="TableGrid"/>
               <w:tblW w:w="0" w:type="auto"/>
               <w:tblBorders>
-                <w:insideH w:val="none" w:color="auto" w:sz="0" w:space="0"/>
                 <w:insideV w:val="none" w:color="auto" w:sz="0" w:space="0"/>
               </w:tblBorders>
               <w:tblLook w:val="04A0" w:firstRow="1" w:lastRow="0" w:firstColumn="1" w:lastColumn="0" w:noHBand="0" w:noVBand="1"/>
+              <w:tblLayout w:type="fixed"/>
             </w:tblPr>
             <w:tblGrid>
-              <w:gridCol w:w="1473"/>
+              <w:gridCol w:w="885"/>
               <w:gridCol w:w="272"/>
-              <w:gridCol w:w="2712"/>
+              <w:gridCol w:w="3300"/>
             </w:tblGrid>
             <w:tr>
               <w:tc>
                 <w:tcPr>
-                  <w:tcW w:w="1485" w:type="dxa"/>
+                  <w:tcW w:w="885" w:type="dxa"/>
                 </w:tcPr>
                 <w:p>
                   <w:pPr>
@@ -277,7 +275,7 @@
               </w:tc>
               <w:tc>
                 <w:tcPr>
-                  <w:tcW w:w="236" w:type="dxa"/>
+                  <w:tcW w:w="270" w:type="dxa"/>
                 </w:tcPr>
                 <w:p>
                   <w:pPr>
@@ -295,7 +293,7 @@
               </w:tc>
               <w:tc>
                 <w:tcPr>
-                  <w:tcW w:w="2736" w:type="dxa"/>
+                  <w:tcW w:w="3302" w:type="dxa"/>
                 </w:tcPr>
                 <w:p>
                   <w:pPr>
@@ -311,7 +309,7 @@
                       <w:sz w:val="18"/>
                       <w:szCs w:val="18"/>
                     </w:rPr>
-                    <w:t>BA 001/PPNEG1000/VI/2026-S0</w:t>
+                    <w:t>Draft</w:t>
                   </w:r>
                 </w:p>
               </w:tc>
@@ -319,7 +317,7 @@
             <w:tr>
               <w:tc>
                 <w:tcPr>
-                  <w:tcW w:w="1485" w:type="dxa"/>
+                  <w:tcW w:w="885" w:type="dxa"/>
                 </w:tcPr>
                 <w:p>
                   <w:pPr>
@@ -341,7 +339,7 @@
               </w:tc>
               <w:tc>
                 <w:tcPr>
-                  <w:tcW w:w="236" w:type="dxa"/>
+                  <w:tcW w:w="270" w:type="dxa"/>
                 </w:tcPr>
                 <w:p>
                   <w:pPr>
@@ -359,7 +357,7 @@
               </w:tc>
               <w:tc>
                 <w:tcPr>
-                  <w:tcW w:w="2736" w:type="dxa"/>
+                  <w:tcW w:w="3302" w:type="dxa"/>
                 </w:tcPr>
                 <w:p>
                   <w:pPr>
@@ -375,7 +373,7 @@
                       <w:sz w:val="18"/>
                       <w:szCs w:val="18"/>
                     </w:rPr>
-                    <w:t>29 Juni 2026</w:t>
+                    <w:t>05 Juli 2026</w:t>
                   </w:r>
                 </w:p>
               </w:tc>
@@ -383,7 +381,7 @@
             <w:tr>
               <w:tc>
                 <w:tcPr>
-                  <w:tcW w:w="1485" w:type="dxa"/>
+                  <w:tcW w:w="885" w:type="dxa"/>
                 </w:tcPr>
                 <w:p>
                   <w:pPr>
@@ -405,7 +403,7 @@
               </w:tc>
               <w:tc>
                 <w:tcPr>
-                  <w:tcW w:w="236" w:type="dxa"/>
+                  <w:tcW w:w="270" w:type="dxa"/>
                 </w:tcPr>
                 <w:p>
                   <w:pPr>
@@ -423,7 +421,7 @@
               </w:tc>
               <w:tc>
                 <w:tcPr>
-                  <w:tcW w:w="2736" w:type="dxa"/>
+                  <w:tcW w:w="3302" w:type="dxa"/>
                 </w:tcPr>
                 <w:p>
                   <w:pPr>
@@ -439,7 +437,7 @@
                       <w:sz w:val="18"/>
                       <w:szCs w:val="18"/>
                     </w:rPr>
-                    <w:t>IT Ssumbagsel</w:t>
+                    <w:t>IT Sumbagsel</w:t>
                   </w:r>
                 </w:p>
               </w:tc>
@@ -447,7 +445,7 @@
             <w:tr>
               <w:tc>
                 <w:tcPr>
-                  <w:tcW w:w="1485" w:type="dxa"/>
+                  <w:tcW w:w="885" w:type="dxa"/>
                 </w:tcPr>
                 <w:p>
                   <w:pPr>
@@ -469,7 +467,7 @@
               </w:tc>
               <w:tc>
                 <w:tcPr>
-                  <w:tcW w:w="236" w:type="dxa"/>
+                  <w:tcW w:w="270" w:type="dxa"/>
                 </w:tcPr>
                 <w:p>
                   <w:pPr>
@@ -487,7 +485,7 @@
               </w:tc>
               <w:tc>
                 <w:tcPr>
-                  <w:tcW w:w="2736" w:type="dxa"/>
+                  <w:tcW w:w="3302" w:type="dxa"/>
                 </w:tcPr>
                 <w:p>
                   <w:pPr>
@@ -503,7 +501,7 @@
                       <w:sz w:val="18"/>
                       <w:szCs w:val="18"/>
                     </w:rPr>
-                    <w:t>Inspector II Reliability</w:t>
+                    <w:t>IT Sumbagsel</w:t>
                   </w:r>
                 </w:p>
               </w:tc>
@@ -529,7 +527,7 @@
           <w:bCs/>
           <w:u w:val="single"/>
         </w:rPr>
-        <w:t xml:space="preserve">BERITA ACARA </w:t>
+        <w:t xml:space="preserve">BERITA ACARA ALOKASI BARANG</w:t>
       </w:r>
       <w:r>
         <w:rPr>
@@ -537,7 +535,7 @@
           <w:bCs/>
           <w:u w:val="single"/>
         </w:rPr>
-        <w:t>PEMINJAMAN</w:t>
+        <w:t/>
       </w:r>
       <w:r>
         <w:rPr>
@@ -545,13 +543,13 @@
           <w:bCs/>
           <w:u w:val="single"/>
         </w:rPr>
-        <w:t xml:space="preserve"> BARANG</w:t>
+        <w:t xml:space="preserve"/>
       </w:r>
     </w:p>
     <w:p/>
     <w:tbl>
       <w:tblPr>
-        <w:tblW w:w="9128" w:type="dxa"/>
+        <w:tblW w:w="9625" w:type="dxa"/>
         <w:tblLayout w:type="fixed"/>
         <w:tblCellMar>
           <w:left w:w="10" w:type="dxa"/>
@@ -560,14 +558,14 @@
         <w:tblLook w:val="04A0" w:firstRow="1" w:lastRow="0" w:firstColumn="1" w:lastColumn="0" w:noHBand="0" w:noVBand="1"/>
       </w:tblPr>
       <w:tblGrid>
-        <w:gridCol w:w="2785"/>
+        <w:gridCol w:w="3775"/>
         <w:gridCol w:w="270"/>
-        <w:gridCol w:w="6073"/>
+        <w:gridCol w:w="5580"/>
       </w:tblGrid>
       <w:tr>
         <w:tc>
           <w:tcPr>
-            <w:tcW w:w="2785" w:type="dxa"/>
+            <w:tcW w:w="3775" w:type="dxa"/>
             <w:tcMar>
               <w:top w:w="60" w:type="dxa"/>
               <w:left w:w="80" w:type="dxa"/>
@@ -577,17 +575,18 @@
           </w:tcPr>
           <w:p>
             <w:pPr>
-              <w:rPr>
-                <w:sz w:val="18"/>
-                <w:szCs w:val="18"/>
-              </w:rPr>
-            </w:pPr>
-            <w:r>
-              <w:rPr>
-                <w:sz w:val="18"/>
-                <w:szCs w:val="18"/>
-              </w:rPr>
-              <w:t xml:space="preserve">Nama </w:t>
+              <w:ind w:left="274"/>
+              <w:rPr>
+                <w:sz w:val="18"/>
+                <w:szCs w:val="18"/>
+              </w:rPr>
+            </w:pPr>
+            <w:r>
+              <w:rPr>
+                <w:sz w:val="18"/>
+                <w:szCs w:val="18"/>
+              </w:rPr>
+              <w:t xml:space="preserve">Nama Pengguna/Penanggung Jawab</w:t>
             </w:r>
             <w:proofErr w:type="spellStart"/>
             <w:r>
@@ -595,7 +594,7 @@
                 <w:sz w:val="18"/>
                 <w:szCs w:val="18"/>
               </w:rPr>
-              <w:t>Penanggung</w:t>
+              <w:t/>
             </w:r>
             <w:proofErr w:type="spellEnd"/>
             <w:r>
@@ -603,7 +602,7 @@
                 <w:sz w:val="18"/>
                 <w:szCs w:val="18"/>
               </w:rPr>
-              <w:t xml:space="preserve"> Jawab</w:t>
+              <w:t xml:space="preserve"/>
             </w:r>
           </w:p>
         </w:tc>
@@ -636,7 +635,7 @@
         </w:tc>
         <w:tc>
           <w:tcPr>
-            <w:tcW w:w="6073" w:type="dxa"/>
+            <w:tcW w:w="5580" w:type="dxa"/>
             <w:tcMar>
               <w:top w:w="60" w:type="dxa"/>
               <w:left w:w="80" w:type="dxa"/>
@@ -656,7 +655,23 @@
                 <w:sz w:val="18"/>
                 <w:szCs w:val="18"/>
               </w:rPr>
-              <w:t>Romi Aprilian Mustafa</w:t>
+              <w:t>ejgaming2 / Romi Aprilian Mustafa</w:t>
+            </w:r>
+            <w:proofErr w:type="spellStart"/>
+            <w:r>
+              <w:rPr>
+                <w:sz w:val="18"/>
+                <w:szCs w:val="18"/>
+              </w:rPr>
+              <w:t/>
+            </w:r>
+            <w:proofErr w:type="spellEnd"/>
+            <w:r>
+              <w:rPr>
+                <w:sz w:val="18"/>
+                <w:szCs w:val="18"/>
+              </w:rPr>
+              <w:t/>
             </w:r>
           </w:p>
         </w:tc>
@@ -664,7 +679,7 @@
       <w:tr>
         <w:tc>
           <w:tcPr>
-            <w:tcW w:w="2785" w:type="dxa"/>
+            <w:tcW w:w="3775" w:type="dxa"/>
             <w:tcMar>
               <w:top w:w="60" w:type="dxa"/>
               <w:left w:w="80" w:type="dxa"/>
@@ -674,6 +689,7 @@
           </w:tcPr>
           <w:p>
             <w:pPr>
+              <w:ind w:left="274"/>
               <w:rPr>
                 <w:sz w:val="18"/>
                 <w:szCs w:val="18"/>
@@ -717,7 +733,7 @@
         </w:tc>
         <w:tc>
           <w:tcPr>
-            <w:tcW w:w="6073" w:type="dxa"/>
+            <w:tcW w:w="5580" w:type="dxa"/>
             <w:tcMar>
               <w:top w:w="60" w:type="dxa"/>
               <w:left w:w="80" w:type="dxa"/>
@@ -739,13 +755,29 @@
               </w:rPr>
               <w:t>123456</w:t>
             </w:r>
+            <w:proofErr w:type="spellStart"/>
+            <w:r>
+              <w:rPr>
+                <w:sz w:val="18"/>
+                <w:szCs w:val="18"/>
+              </w:rPr>
+              <w:t/>
+            </w:r>
+            <w:proofErr w:type="spellEnd"/>
+            <w:r>
+              <w:rPr>
+                <w:sz w:val="18"/>
+                <w:szCs w:val="18"/>
+              </w:rPr>
+              <w:t/>
+            </w:r>
           </w:p>
         </w:tc>
       </w:tr>
       <w:tr>
         <w:tc>
           <w:tcPr>
-            <w:tcW w:w="2785" w:type="dxa"/>
+            <w:tcW w:w="3775" w:type="dxa"/>
             <w:tcMar>
               <w:top w:w="60" w:type="dxa"/>
               <w:left w:w="80" w:type="dxa"/>
@@ -755,18 +787,21 @@
           </w:tcPr>
           <w:p>
             <w:pPr>
-              <w:rPr>
-                <w:sz w:val="18"/>
-                <w:szCs w:val="18"/>
-              </w:rPr>
-            </w:pPr>
-            <w:r>
-              <w:rPr>
-                <w:sz w:val="18"/>
-                <w:szCs w:val="18"/>
-              </w:rPr>
-              <w:t>J a b a t a n</w:t>
-            </w:r>
+              <w:ind w:left="274"/>
+              <w:rPr>
+                <w:sz w:val="18"/>
+                <w:szCs w:val="18"/>
+              </w:rPr>
+            </w:pPr>
+            <w:proofErr w:type="spellStart"/>
+            <w:r>
+              <w:rPr>
+                <w:sz w:val="18"/>
+                <w:szCs w:val="18"/>
+              </w:rPr>
+              <w:t>Jabatan</w:t>
+            </w:r>
+            <w:proofErr w:type="spellEnd"/>
           </w:p>
         </w:tc>
         <w:tc>
@@ -798,7 +833,7 @@
         </w:tc>
         <w:tc>
           <w:tcPr>
-            <w:tcW w:w="6073" w:type="dxa"/>
+            <w:tcW w:w="5580" w:type="dxa"/>
             <w:tcMar>
               <w:top w:w="60" w:type="dxa"/>
               <w:left w:w="80" w:type="dxa"/>
@@ -820,13 +855,29 @@
               </w:rPr>
               <w:t>Jr Officer I Operation Delivery</w:t>
             </w:r>
+            <w:proofErr w:type="spellStart"/>
+            <w:r>
+              <w:rPr>
+                <w:sz w:val="18"/>
+                <w:szCs w:val="18"/>
+              </w:rPr>
+              <w:t/>
+            </w:r>
+            <w:proofErr w:type="spellEnd"/>
+            <w:r>
+              <w:rPr>
+                <w:sz w:val="18"/>
+                <w:szCs w:val="18"/>
+              </w:rPr>
+              <w:t/>
+            </w:r>
           </w:p>
         </w:tc>
       </w:tr>
       <w:tr>
         <w:tc>
           <w:tcPr>
-            <w:tcW w:w="2785" w:type="dxa"/>
+            <w:tcW w:w="3775" w:type="dxa"/>
             <w:tcMar>
               <w:top w:w="60" w:type="dxa"/>
               <w:left w:w="80" w:type="dxa"/>
@@ -836,6 +887,7 @@
           </w:tcPr>
           <w:p>
             <w:pPr>
+              <w:ind w:left="274"/>
               <w:rPr>
                 <w:sz w:val="18"/>
                 <w:szCs w:val="18"/>
@@ -897,7 +949,7 @@
         </w:tc>
         <w:tc>
           <w:tcPr>
-            <w:tcW w:w="6073" w:type="dxa"/>
+            <w:tcW w:w="5580" w:type="dxa"/>
             <w:tcMar>
               <w:top w:w="60" w:type="dxa"/>
               <w:left w:w="80" w:type="dxa"/>
@@ -919,13 +971,29 @@
               </w:rPr>
               <w:t>IT Sumbagsel</w:t>
             </w:r>
+            <w:proofErr w:type="spellStart"/>
+            <w:r>
+              <w:rPr>
+                <w:sz w:val="18"/>
+                <w:szCs w:val="18"/>
+              </w:rPr>
+              <w:t/>
+            </w:r>
+            <w:proofErr w:type="spellEnd"/>
+            <w:r>
+              <w:rPr>
+                <w:sz w:val="18"/>
+                <w:szCs w:val="18"/>
+              </w:rPr>
+              <w:t/>
+            </w:r>
           </w:p>
         </w:tc>
       </w:tr>
       <w:tr>
         <w:tc>
           <w:tcPr>
-            <w:tcW w:w="2785" w:type="dxa"/>
+            <w:tcW w:w="3775" w:type="dxa"/>
             <w:tcMar>
               <w:top w:w="60" w:type="dxa"/>
               <w:left w:w="80" w:type="dxa"/>
@@ -935,6 +1003,7 @@
           </w:tcPr>
           <w:p>
             <w:pPr>
+              <w:ind w:left="274"/>
               <w:rPr>
                 <w:sz w:val="18"/>
                 <w:szCs w:val="18"/>
@@ -978,7 +1047,7 @@
         </w:tc>
         <w:tc>
           <w:tcPr>
-            <w:tcW w:w="6073" w:type="dxa"/>
+            <w:tcW w:w="5580" w:type="dxa"/>
             <w:tcMar>
               <w:top w:w="60" w:type="dxa"/>
               <w:left w:w="80" w:type="dxa"/>
@@ -1000,13 +1069,29 @@
               </w:rPr>
               <w:t>IT Sumbagsel</w:t>
             </w:r>
+            <w:proofErr w:type="spellStart"/>
+            <w:r>
+              <w:rPr>
+                <w:sz w:val="18"/>
+                <w:szCs w:val="18"/>
+              </w:rPr>
+              <w:t/>
+            </w:r>
+            <w:proofErr w:type="spellEnd"/>
+            <w:r>
+              <w:rPr>
+                <w:sz w:val="18"/>
+                <w:szCs w:val="18"/>
+              </w:rPr>
+              <w:t/>
+            </w:r>
           </w:p>
         </w:tc>
       </w:tr>
       <w:tr>
         <w:tc>
           <w:tcPr>
-            <w:tcW w:w="2785" w:type="dxa"/>
+            <w:tcW w:w="3775" w:type="dxa"/>
             <w:tcMar>
               <w:top w:w="60" w:type="dxa"/>
               <w:left w:w="80" w:type="dxa"/>
@@ -1016,6 +1101,7 @@
           </w:tcPr>
           <w:p>
             <w:pPr>
+              <w:ind w:left="274"/>
               <w:rPr>
                 <w:sz w:val="18"/>
                 <w:szCs w:val="18"/>
@@ -1059,7 +1145,7 @@
         </w:tc>
         <w:tc>
           <w:tcPr>
-            <w:tcW w:w="6073" w:type="dxa"/>
+            <w:tcW w:w="5580" w:type="dxa"/>
             <w:tcMar>
               <w:top w:w="60" w:type="dxa"/>
               <w:left w:w="80" w:type="dxa"/>
@@ -1081,13 +1167,29 @@
               </w:rPr>
               <w:t>romiaprilian7406@gmail.com</w:t>
             </w:r>
+            <w:proofErr w:type="spellStart"/>
+            <w:r>
+              <w:rPr>
+                <w:sz w:val="18"/>
+                <w:szCs w:val="18"/>
+              </w:rPr>
+              <w:t/>
+            </w:r>
+            <w:proofErr w:type="spellEnd"/>
+            <w:r>
+              <w:rPr>
+                <w:sz w:val="18"/>
+                <w:szCs w:val="18"/>
+              </w:rPr>
+              <w:t/>
+            </w:r>
           </w:p>
         </w:tc>
       </w:tr>
       <w:tr>
         <w:tc>
           <w:tcPr>
-            <w:tcW w:w="2785" w:type="dxa"/>
+            <w:tcW w:w="3775" w:type="dxa"/>
             <w:tcMar>
               <w:top w:w="60" w:type="dxa"/>
               <w:left w:w="80" w:type="dxa"/>
@@ -1097,6 +1199,7 @@
           </w:tcPr>
           <w:p>
             <w:pPr>
+              <w:ind w:left="274"/>
               <w:rPr>
                 <w:sz w:val="18"/>
                 <w:szCs w:val="18"/>
@@ -1149,7 +1252,7 @@
         </w:tc>
         <w:tc>
           <w:tcPr>
-            <w:tcW w:w="6073" w:type="dxa"/>
+            <w:tcW w:w="5580" w:type="dxa"/>
             <w:tcMar>
               <w:top w:w="60" w:type="dxa"/>
               <w:left w:w="80" w:type="dxa"/>
@@ -1171,13 +1274,29 @@
               </w:rPr>
               <w:t>1</w:t>
             </w:r>
+            <w:proofErr w:type="spellStart"/>
+            <w:r>
+              <w:rPr>
+                <w:sz w:val="18"/>
+                <w:szCs w:val="18"/>
+              </w:rPr>
+              <w:t/>
+            </w:r>
+            <w:proofErr w:type="spellEnd"/>
+            <w:r>
+              <w:rPr>
+                <w:sz w:val="18"/>
+                <w:szCs w:val="18"/>
+              </w:rPr>
+              <w:t/>
+            </w:r>
           </w:p>
         </w:tc>
       </w:tr>
       <w:tr>
         <w:tc>
           <w:tcPr>
-            <w:tcW w:w="2785" w:type="dxa"/>
+            <w:tcW w:w="3775" w:type="dxa"/>
             <w:tcMar>
               <w:top w:w="60" w:type="dxa"/>
               <w:left w:w="80" w:type="dxa"/>
@@ -1187,17 +1306,18 @@
           </w:tcPr>
           <w:p>
             <w:pPr>
-              <w:rPr>
-                <w:sz w:val="18"/>
-                <w:szCs w:val="18"/>
-              </w:rPr>
-            </w:pPr>
-            <w:r>
-              <w:rPr>
-                <w:sz w:val="18"/>
-                <w:szCs w:val="18"/>
-              </w:rPr>
-              <w:t>No. Telp / HP</w:t>
+              <w:ind w:left="274"/>
+              <w:rPr>
+                <w:sz w:val="18"/>
+                <w:szCs w:val="18"/>
+              </w:rPr>
+            </w:pPr>
+            <w:r>
+              <w:rPr>
+                <w:sz w:val="18"/>
+                <w:szCs w:val="18"/>
+              </w:rPr>
+              <w:t>No. Telp/HP</w:t>
             </w:r>
           </w:p>
         </w:tc>
@@ -1230,7 +1350,7 @@
         </w:tc>
         <w:tc>
           <w:tcPr>
-            <w:tcW w:w="6073" w:type="dxa"/>
+            <w:tcW w:w="5580" w:type="dxa"/>
             <w:tcMar>
               <w:top w:w="60" w:type="dxa"/>
               <w:left w:w="80" w:type="dxa"/>
@@ -1250,7 +1370,23 @@
                 <w:sz w:val="18"/>
                 <w:szCs w:val="18"/>
               </w:rPr>
-              <w:t>0812345678</w:t>
+              <w:t>0812324234</w:t>
+            </w:r>
+            <w:proofErr w:type="spellStart"/>
+            <w:r>
+              <w:rPr>
+                <w:sz w:val="18"/>
+                <w:szCs w:val="18"/>
+              </w:rPr>
+              <w:t/>
+            </w:r>
+            <w:proofErr w:type="spellEnd"/>
+            <w:r>
+              <w:rPr>
+                <w:sz w:val="18"/>
+                <w:szCs w:val="18"/>
+              </w:rPr>
+              <w:t/>
             </w:r>
           </w:p>
         </w:tc>
@@ -1264,6 +1400,7 @@
     <w:p>
       <w:pPr>
         <w:spacing w:line="276" w:lineRule="auto"/>
+        <w:ind w:left="360"/>
         <w:jc w:val="both"/>
         <w:rPr>
           <w:b/>
@@ -1279,7 +1416,7 @@
           <w:sz w:val="18"/>
           <w:szCs w:val="18"/>
         </w:rPr>
-        <w:t xml:space="preserve">Pada hari ini Senin Tanggal 29 Juni 2026 telah diserahterimakan perangkat dengan spesifikasi serta syarat-syarat dan ketentuan sebagai berikut:</w:t>
+        <w:t xml:space="preserve">Pada hari ini Minggu Tanggal 5 Juli 2026 telah diserahterimakan perangkat dengan spesifikasi serta syarat-syarat dan ketentuan sebagai berikut:</w:t>
       </w:r>
       <w:proofErr w:type="spellStart"/>
       <w:r>
@@ -1711,7 +1848,7 @@
           <w:u w:val="single"/>
           <w:lang w:val="nb-NO"/>
         </w:rPr>
-        <w:t>Jenis Perangkat Keras: Mouse, Router, Switch</w:t>
+        <w:t>Jenis Perangkat Keras: Anti Static Wrist Strap, Cable Tester, Bridge, Fiber Cleaver</w:t>
       </w:r>
       <w:r>
         <w:rPr>
@@ -1776,6 +1913,7 @@
                 <w:insideV w:val="none" w:color="auto" w:sz="0" w:space="0"/>
               </w:tblBorders>
               <w:tblLook w:val="04A0" w:firstRow="1" w:lastRow="0" w:firstColumn="1" w:lastColumn="0" w:noHBand="0" w:noVBand="1"/>
+              <w:tblLayout w:type="fixed"/>
             </w:tblPr>
             <w:tblGrid>
               <w:gridCol w:w="579"/>
@@ -1810,7 +1948,6 @@
                   <w:pPr>
                     <w:pStyle w:val="ListParagraph"/>
                     <w:ind w:left="0"/>
-                    <w:jc w:val="center"/>
                     <w:rPr>
                       <w:b/>
                       <w:bCs/>
@@ -1889,6 +2026,7 @@
                 <w:insideV w:val="none" w:color="auto" w:sz="0" w:space="0"/>
               </w:tblBorders>
               <w:tblLook w:val="04A0" w:firstRow="1" w:lastRow="0" w:firstColumn="1" w:lastColumn="0" w:noHBand="0" w:noVBand="1"/>
+              <w:tblLayout w:type="fixed"/>
             </w:tblPr>
             <w:tblGrid>
               <w:gridCol w:w="922"/>
@@ -1977,7 +2115,6 @@
                   <w:pPr>
                     <w:pStyle w:val="ListParagraph"/>
                     <w:ind w:left="0"/>
-                    <w:jc w:val="center"/>
                     <w:rPr>
                       <w:b/>
                       <w:bCs/>
@@ -2154,6 +2291,7 @@
             <w:pPr>
               <w:pStyle w:val="ListParagraph"/>
               <w:ind w:left="0"/>
+              <w:jc w:val="center"/>
               <w:rPr>
                 <w:b/>
                 <w:bCs/>
@@ -2216,7 +2354,7 @@
                 <w:szCs w:val="18"/>
                 <w:lang w:val="nb-NO"/>
               </w:rPr>
-              <w:t>1.</w:t>
+              <w:t>1</w:t>
             </w:r>
           </w:p>
         </w:tc>
@@ -2243,7 +2381,7 @@
                 <w:szCs w:val="18"/>
                 <w:lang w:val="nb-NO"/>
               </w:rPr>
-              <w:t>10</w:t>
+              <w:t>1</w:t>
             </w:r>
           </w:p>
         </w:tc>
@@ -2270,7 +2408,7 @@
                 <w:szCs w:val="18"/>
                 <w:lang w:val="nb-NO"/>
               </w:rPr>
-              <w:t>Sepuluh</w:t>
+              <w:t>Satu</w:t>
             </w:r>
           </w:p>
         </w:tc>
@@ -2324,7 +2462,7 @@
                 <w:szCs w:val="18"/>
                 <w:lang w:val="nb-NO"/>
               </w:rPr>
-              <w:t>khvcqerv</w:t>
+              <w:t>-</w:t>
             </w:r>
           </w:p>
         </w:tc>
@@ -2351,7 +2489,7 @@
                 <w:szCs w:val="18"/>
                 <w:lang w:val="nb-NO"/>
               </w:rPr>
-              <w:t>qlhbfhqe</w:t>
+              <w:t>-</w:t>
             </w:r>
           </w:p>
         </w:tc>
@@ -2380,7 +2518,7 @@
                 <w:szCs w:val="18"/>
                 <w:lang w:val="nb-NO"/>
               </w:rPr>
-              <w:t>2.</w:t>
+              <w:t>2</w:t>
             </w:r>
           </w:p>
         </w:tc>
@@ -2488,7 +2626,7 @@
                 <w:szCs w:val="18"/>
                 <w:lang w:val="nb-NO"/>
               </w:rPr>
-              <w:t>iuqshfgv</w:t>
+              <w:t>-</w:t>
             </w:r>
           </w:p>
         </w:tc>
@@ -2515,7 +2653,7 @@
                 <w:szCs w:val="18"/>
                 <w:lang w:val="nb-NO"/>
               </w:rPr>
-              <w:t>32841</w:t>
+              <w:t>-</w:t>
             </w:r>
           </w:p>
         </w:tc>
@@ -2544,7 +2682,7 @@
                 <w:szCs w:val="18"/>
                 <w:lang w:val="nb-NO"/>
               </w:rPr>
-              <w:t>3.</w:t>
+              <w:t>3</w:t>
             </w:r>
           </w:p>
         </w:tc>
@@ -2652,7 +2790,7 @@
                 <w:szCs w:val="18"/>
                 <w:lang w:val="nb-NO"/>
               </w:rPr>
-              <w:t>isdbvw</w:t>
+              <w:t>-</w:t>
             </w:r>
           </w:p>
         </w:tc>
@@ -2679,7 +2817,171 @@
                 <w:szCs w:val="18"/>
                 <w:lang w:val="nb-NO"/>
               </w:rPr>
-              <w:t>qwehbf</w:t>
+              <w:t>-</w:t>
+            </w:r>
+          </w:p>
+        </w:tc>
+      </w:tr>
+      <w:tr>
+        <w:tc>
+          <w:tcPr>
+            <w:tcW w:w="805" w:type="dxa"/>
+          </w:tcPr>
+          <w:p>
+            <w:pPr>
+              <w:pStyle w:val="ListParagraph"/>
+              <w:ind w:left="0"/>
+              <w:jc w:val="center"/>
+              <w:rPr>
+                <w:noProof/>
+                <w:sz w:val="18"/>
+                <w:szCs w:val="18"/>
+                <w:lang w:val="nb-NO"/>
+              </w:rPr>
+            </w:pPr>
+            <w:r>
+              <w:rPr>
+                <w:noProof/>
+                <w:sz w:val="18"/>
+                <w:szCs w:val="18"/>
+                <w:lang w:val="nb-NO"/>
+              </w:rPr>
+              <w:t>4</w:t>
+            </w:r>
+          </w:p>
+        </w:tc>
+        <w:tc>
+          <w:tcPr>
+            <w:tcW w:w="1080" w:type="dxa"/>
+          </w:tcPr>
+          <w:p>
+            <w:pPr>
+              <w:pStyle w:val="ListParagraph"/>
+              <w:ind w:left="0"/>
+              <w:jc w:val="center"/>
+              <w:rPr>
+                <w:noProof/>
+                <w:sz w:val="18"/>
+                <w:szCs w:val="18"/>
+                <w:lang w:val="nb-NO"/>
+              </w:rPr>
+            </w:pPr>
+            <w:r>
+              <w:rPr>
+                <w:noProof/>
+                <w:sz w:val="18"/>
+                <w:szCs w:val="18"/>
+                <w:lang w:val="nb-NO"/>
+              </w:rPr>
+              <w:t>1</w:t>
+            </w:r>
+          </w:p>
+        </w:tc>
+        <w:tc>
+          <w:tcPr>
+            <w:tcW w:w="990" w:type="dxa"/>
+          </w:tcPr>
+          <w:p>
+            <w:pPr>
+              <w:pStyle w:val="ListParagraph"/>
+              <w:ind w:left="0"/>
+              <w:jc w:val="center"/>
+              <w:rPr>
+                <w:noProof/>
+                <w:sz w:val="18"/>
+                <w:szCs w:val="18"/>
+                <w:lang w:val="nb-NO"/>
+              </w:rPr>
+            </w:pPr>
+            <w:r>
+              <w:rPr>
+                <w:noProof/>
+                <w:sz w:val="18"/>
+                <w:szCs w:val="18"/>
+                <w:lang w:val="nb-NO"/>
+              </w:rPr>
+              <w:t>Satu</w:t>
+            </w:r>
+          </w:p>
+        </w:tc>
+        <w:tc>
+          <w:tcPr>
+            <w:tcW w:w="1170" w:type="dxa"/>
+          </w:tcPr>
+          <w:p>
+            <w:pPr>
+              <w:pStyle w:val="ListParagraph"/>
+              <w:ind w:left="0"/>
+              <w:jc w:val="center"/>
+              <w:rPr>
+                <w:noProof/>
+                <w:sz w:val="18"/>
+                <w:szCs w:val="18"/>
+                <w:lang w:val="nb-NO"/>
+              </w:rPr>
+            </w:pPr>
+            <w:r>
+              <w:rPr>
+                <w:noProof/>
+                <w:sz w:val="18"/>
+                <w:szCs w:val="18"/>
+                <w:lang w:val="nb-NO"/>
+              </w:rPr>
+              <w:t>Pcs</w:t>
+            </w:r>
+          </w:p>
+        </w:tc>
+        <w:tc>
+          <w:tcPr>
+            <w:tcW w:w="2250" w:type="dxa"/>
+          </w:tcPr>
+          <w:p>
+            <w:pPr>
+              <w:pStyle w:val="ListParagraph"/>
+              <w:ind w:left="0"/>
+              <w:jc w:val="center"/>
+              <w:rPr>
+                <w:noProof/>
+                <w:sz w:val="18"/>
+                <w:szCs w:val="18"/>
+                <w:lang w:val="nb-NO"/>
+              </w:rPr>
+            </w:pPr>
+            <w:r>
+              <w:rPr>
+                <w:noProof/>
+                <w:sz w:val="18"/>
+                <w:szCs w:val="18"/>
+                <w:lang w:val="nb-NO"/>
+              </w:rPr>
+              <w:t>-</w:t>
+            </w:r>
+          </w:p>
+        </w:tc>
+        <w:tc>
+          <w:tcPr>
+            <w:tcW w:w="2973" w:type="dxa"/>
+          </w:tcPr>
+          <w:p>
+            <w:pPr>
+              <w:pStyle w:val="ListParagraph"/>
+              <w:ind w:left="0"/>
+              <w:jc w:val="center"/>
+              <w:rPr>
+                <w:noProof/>
+                <w:sz w:val="18"/>
+                <w:szCs w:val="18"/>
+                <w:lang w:val="nb-NO"/>
+              </w:rPr>
+            </w:pPr>
+            <w:r>
+              <w:rPr>
+                <w:noProof/>
+                <w:sz w:val="18"/>
+                <w:szCs w:val="18"/>
+                <w:lang w:val="nb-NO"/>
+              </w:rPr>
+              <w:t>-</w:t>
             </w:r>
           </w:p>
         </w:tc>
@@ -2711,25 +3013,7 @@
                 <w:szCs w:val="18"/>
                 <w:lang w:val="nb-NO"/>
               </w:rPr>
-              <w:t>Catatan: Perangkat IT ini di</w:t>
-            </w:r>
-            <w:r>
-              <w:rPr>
-                <w:noProof/>
-                <w:sz w:val="18"/>
-                <w:szCs w:val="18"/>
-                <w:lang w:val="nb-NO"/>
-              </w:rPr>
-              <w:t>pinjamkan</w:t>
-            </w:r>
-            <w:r>
-              <w:rPr>
-                <w:noProof/>
-                <w:sz w:val="18"/>
-                <w:szCs w:val="18"/>
-                <w:lang w:val="nb-NO"/>
-              </w:rPr>
-              <w:t xml:space="preserve"> berdasarkan</w:t>
+              <w:t>Catatan: Perangkat IT ini dialokasikan berdasarkan</w:t>
             </w:r>
           </w:p>
           <w:p>
@@ -2748,15 +3032,7 @@
                 <w:sz w:val="18"/>
                 <w:szCs w:val="18"/>
               </w:rPr>
-              <w:t>Tiket di My SSC NO. ABCD1234                                                        Tanggal pengembalian: 04 Juli 2026</w:t>
-            </w:r>
-            <w:r>
-              <w:rPr>
-                <w:noProof/>
-                <w:sz w:val="18"/>
-                <w:szCs w:val="18"/>
-              </w:rPr>
-              <w:t xml:space="preserve"/>
+              <w:t>Tiket di My SSC NO. -</w:t>
             </w:r>
           </w:p>
         </w:tc>
@@ -2886,6 +3162,22 @@
           <w:sz w:val="18"/>
           <w:szCs w:val="18"/>
         </w:rPr>
+        <w:t>barang</w:t>
+      </w:r>
+      <w:proofErr w:type="spellEnd"/>
+      <w:r>
+        <w:rPr>
+          <w:sz w:val="18"/>
+          <w:szCs w:val="18"/>
+        </w:rPr>
+        <w:t>/</w:t>
+      </w:r>
+      <w:proofErr w:type="spellStart"/>
+      <w:r>
+        <w:rPr>
+          <w:sz w:val="18"/>
+          <w:szCs w:val="18"/>
+        </w:rPr>
         <w:t>peralatan</w:t>
       </w:r>
       <w:proofErr w:type="spellEnd"/>
@@ -2902,7 +3194,7 @@
           <w:sz w:val="18"/>
           <w:szCs w:val="18"/>
         </w:rPr>
-        <w:t>digunakannya</w:t>
+        <w:t>diterima</w:t>
       </w:r>
       <w:proofErr w:type="spellEnd"/>
       <w:r>
@@ -2918,6 +3210,54 @@
           <w:sz w:val="18"/>
           <w:szCs w:val="18"/>
         </w:rPr>
+        <w:t>digunakan</w:t>
+      </w:r>
+      <w:proofErr w:type="spellEnd"/>
+      <w:r>
+        <w:rPr>
+          <w:sz w:val="18"/>
+          <w:szCs w:val="18"/>
+        </w:rPr>
+        <w:t xml:space="preserve"> </w:t>
+      </w:r>
+      <w:proofErr w:type="spellStart"/>
+      <w:r>
+        <w:rPr>
+          <w:sz w:val="18"/>
+          <w:szCs w:val="18"/>
+        </w:rPr>
+        <w:t>serta</w:t>
+      </w:r>
+      <w:proofErr w:type="spellEnd"/>
+      <w:r>
+        <w:rPr>
+          <w:sz w:val="18"/>
+          <w:szCs w:val="18"/>
+        </w:rPr>
+        <w:t xml:space="preserve"> </w:t>
+      </w:r>
+      <w:proofErr w:type="spellStart"/>
+      <w:r>
+        <w:rPr>
+          <w:sz w:val="18"/>
+          <w:szCs w:val="18"/>
+        </w:rPr>
+        <w:t>menyatakan</w:t>
+      </w:r>
+      <w:proofErr w:type="spellEnd"/>
+      <w:r>
+        <w:rPr>
+          <w:sz w:val="18"/>
+          <w:szCs w:val="18"/>
+        </w:rPr>
+        <w:t xml:space="preserve"> </w:t>
+      </w:r>
+      <w:proofErr w:type="spellStart"/>
+      <w:r>
+        <w:rPr>
+          <w:sz w:val="18"/>
+          <w:szCs w:val="18"/>
+        </w:rPr>
         <w:t>telah</w:t>
       </w:r>
       <w:proofErr w:type="spellEnd"/>
@@ -2942,15 +3282,31 @@
           <w:sz w:val="18"/>
           <w:szCs w:val="18"/>
         </w:rPr>
-        <w:t xml:space="preserve"> dan </w:t>
-      </w:r>
-      <w:proofErr w:type="spellStart"/>
-      <w:r>
-        <w:rPr>
-          <w:sz w:val="18"/>
-          <w:szCs w:val="18"/>
-        </w:rPr>
-        <w:t>setuju</w:t>
+        <w:t xml:space="preserve">, </w:t>
+      </w:r>
+      <w:proofErr w:type="spellStart"/>
+      <w:r>
+        <w:rPr>
+          <w:sz w:val="18"/>
+          <w:szCs w:val="18"/>
+        </w:rPr>
+        <w:t>memahami</w:t>
+      </w:r>
+      <w:proofErr w:type="spellEnd"/>
+      <w:r>
+        <w:rPr>
+          <w:sz w:val="18"/>
+          <w:szCs w:val="18"/>
+        </w:rPr>
+        <w:t xml:space="preserve">, dan </w:t>
+      </w:r>
+      <w:proofErr w:type="spellStart"/>
+      <w:r>
+        <w:rPr>
+          <w:sz w:val="18"/>
+          <w:szCs w:val="18"/>
+        </w:rPr>
+        <w:t>menyetujui</w:t>
       </w:r>
       <w:proofErr w:type="spellEnd"/>
       <w:r>
@@ -2966,7 +3322,7 @@
           <w:sz w:val="18"/>
           <w:szCs w:val="18"/>
         </w:rPr>
-        <w:t>dengan</w:t>
+        <w:t>seluruh</w:t>
       </w:r>
       <w:proofErr w:type="spellEnd"/>
       <w:r>
@@ -2990,6 +3346,22 @@
           <w:sz w:val="18"/>
           <w:szCs w:val="18"/>
         </w:rPr>
+        <w:t xml:space="preserve"> yang </w:t>
+      </w:r>
+      <w:proofErr w:type="spellStart"/>
+      <w:r>
+        <w:rPr>
+          <w:sz w:val="18"/>
+          <w:szCs w:val="18"/>
+        </w:rPr>
+        <w:t>tercantum</w:t>
+      </w:r>
+      <w:proofErr w:type="spellEnd"/>
+      <w:r>
+        <w:rPr>
+          <w:sz w:val="18"/>
+          <w:szCs w:val="18"/>
+        </w:rPr>
         <w:t xml:space="preserve"> </w:t>
       </w:r>
       <w:proofErr w:type="spellStart"/>
@@ -2998,6 +3370,86 @@
           <w:sz w:val="18"/>
           <w:szCs w:val="18"/>
         </w:rPr>
+        <w:t>dalam</w:t>
+      </w:r>
+      <w:proofErr w:type="spellEnd"/>
+      <w:r>
+        <w:rPr>
+          <w:sz w:val="18"/>
+          <w:szCs w:val="18"/>
+        </w:rPr>
+        <w:t xml:space="preserve"> Berita Acara Serah </w:t>
+      </w:r>
+      <w:proofErr w:type="spellStart"/>
+      <w:r>
+        <w:rPr>
+          <w:sz w:val="18"/>
+          <w:szCs w:val="18"/>
+        </w:rPr>
+        <w:t>Terima</w:t>
+      </w:r>
+      <w:proofErr w:type="spellEnd"/>
+      <w:r>
+        <w:rPr>
+          <w:sz w:val="18"/>
+          <w:szCs w:val="18"/>
+        </w:rPr>
+        <w:t xml:space="preserve"> </w:t>
+      </w:r>
+      <w:proofErr w:type="spellStart"/>
+      <w:r>
+        <w:rPr>
+          <w:sz w:val="18"/>
+          <w:szCs w:val="18"/>
+        </w:rPr>
+        <w:t>ini</w:t>
+      </w:r>
+      <w:proofErr w:type="spellEnd"/>
+      <w:r>
+        <w:rPr>
+          <w:sz w:val="18"/>
+          <w:szCs w:val="18"/>
+        </w:rPr>
+        <w:t xml:space="preserve"> </w:t>
+      </w:r>
+      <w:proofErr w:type="spellStart"/>
+      <w:r>
+        <w:rPr>
+          <w:sz w:val="18"/>
+          <w:szCs w:val="18"/>
+        </w:rPr>
+        <w:t>beserta</w:t>
+      </w:r>
+      <w:proofErr w:type="spellEnd"/>
+      <w:r>
+        <w:rPr>
+          <w:sz w:val="18"/>
+          <w:szCs w:val="18"/>
+        </w:rPr>
+        <w:t xml:space="preserve"> </w:t>
+      </w:r>
+      <w:proofErr w:type="spellStart"/>
+      <w:r>
+        <w:rPr>
+          <w:sz w:val="18"/>
+          <w:szCs w:val="18"/>
+        </w:rPr>
+        <w:t>ketentuan</w:t>
+      </w:r>
+      <w:proofErr w:type="spellEnd"/>
+      <w:r>
+        <w:rPr>
+          <w:sz w:val="18"/>
+          <w:szCs w:val="18"/>
+        </w:rPr>
+        <w:t xml:space="preserve"> </w:t>
+      </w:r>
+      <w:proofErr w:type="spellStart"/>
+      <w:r>
+        <w:rPr>
+          <w:sz w:val="18"/>
+          <w:szCs w:val="18"/>
+        </w:rPr>
         <w:t>tambahan</w:t>
       </w:r>
       <w:proofErr w:type="spellEnd"/>
@@ -3014,175 +3466,15 @@
           <w:sz w:val="18"/>
           <w:szCs w:val="18"/>
         </w:rPr>
-        <w:t>tercantum</w:t>
-      </w:r>
-      <w:proofErr w:type="spellEnd"/>
-      <w:r>
-        <w:rPr>
-          <w:sz w:val="18"/>
-          <w:szCs w:val="18"/>
-        </w:rPr>
-        <w:t xml:space="preserve"> pada </w:t>
-      </w:r>
-      <w:proofErr w:type="spellStart"/>
-      <w:r>
-        <w:rPr>
-          <w:sz w:val="18"/>
-          <w:szCs w:val="18"/>
-        </w:rPr>
-        <w:t>halaman</w:t>
-      </w:r>
-      <w:proofErr w:type="spellEnd"/>
-      <w:r>
-        <w:rPr>
-          <w:sz w:val="18"/>
-          <w:szCs w:val="18"/>
-        </w:rPr>
-        <w:t xml:space="preserve"> </w:t>
-      </w:r>
-      <w:proofErr w:type="spellStart"/>
-      <w:r>
-        <w:rPr>
-          <w:sz w:val="18"/>
-          <w:szCs w:val="18"/>
-        </w:rPr>
-        <w:t>belakang</w:t>
-      </w:r>
-      <w:proofErr w:type="spellEnd"/>
-      <w:r>
-        <w:rPr>
-          <w:sz w:val="18"/>
-          <w:szCs w:val="18"/>
-        </w:rPr>
-        <w:t xml:space="preserve"> </w:t>
-      </w:r>
-      <w:proofErr w:type="spellStart"/>
-      <w:r>
-        <w:rPr>
-          <w:sz w:val="18"/>
-          <w:szCs w:val="18"/>
-        </w:rPr>
-        <w:t>dari</w:t>
-      </w:r>
-      <w:proofErr w:type="spellEnd"/>
-      <w:r>
-        <w:rPr>
-          <w:sz w:val="18"/>
-          <w:szCs w:val="18"/>
-        </w:rPr>
-        <w:t xml:space="preserve"> </w:t>
-      </w:r>
-      <w:proofErr w:type="spellStart"/>
-      <w:r>
-        <w:rPr>
-          <w:sz w:val="18"/>
-          <w:szCs w:val="18"/>
-        </w:rPr>
-        <w:t>lembar</w:t>
-      </w:r>
-      <w:proofErr w:type="spellEnd"/>
-      <w:r>
-        <w:rPr>
-          <w:sz w:val="18"/>
-          <w:szCs w:val="18"/>
-        </w:rPr>
-        <w:t xml:space="preserve"> </w:t>
-      </w:r>
-      <w:proofErr w:type="spellStart"/>
-      <w:r>
-        <w:rPr>
-          <w:sz w:val="18"/>
-          <w:szCs w:val="18"/>
-        </w:rPr>
-        <w:t>bukti</w:t>
-      </w:r>
-      <w:proofErr w:type="spellEnd"/>
-      <w:r>
-        <w:rPr>
-          <w:sz w:val="18"/>
-          <w:szCs w:val="18"/>
-        </w:rPr>
-        <w:t xml:space="preserve"> </w:t>
-      </w:r>
-      <w:proofErr w:type="spellStart"/>
-      <w:r>
-        <w:rPr>
-          <w:sz w:val="18"/>
-          <w:szCs w:val="18"/>
-        </w:rPr>
-        <w:t>penerimaan</w:t>
-      </w:r>
-      <w:proofErr w:type="spellEnd"/>
-      <w:r>
-        <w:rPr>
-          <w:sz w:val="18"/>
-          <w:szCs w:val="18"/>
-        </w:rPr>
-        <w:t xml:space="preserve"> </w:t>
-      </w:r>
-      <w:proofErr w:type="spellStart"/>
-      <w:r>
-        <w:rPr>
-          <w:sz w:val="18"/>
-          <w:szCs w:val="18"/>
-        </w:rPr>
-        <w:t>barang</w:t>
-      </w:r>
-      <w:proofErr w:type="spellEnd"/>
-      <w:r>
-        <w:rPr>
-          <w:sz w:val="18"/>
-          <w:szCs w:val="18"/>
-        </w:rPr>
-        <w:t xml:space="preserve"> </w:t>
-      </w:r>
-      <w:proofErr w:type="spellStart"/>
-      <w:r>
-        <w:rPr>
-          <w:sz w:val="18"/>
-          <w:szCs w:val="18"/>
-        </w:rPr>
-        <w:t>ini</w:t>
-      </w:r>
-      <w:proofErr w:type="spellEnd"/>
-      <w:r>
-        <w:rPr>
-          <w:sz w:val="18"/>
-          <w:szCs w:val="18"/>
-        </w:rPr>
-        <w:t xml:space="preserve"> (</w:t>
-      </w:r>
-      <w:proofErr w:type="spellStart"/>
-      <w:r>
-        <w:rPr>
-          <w:sz w:val="18"/>
-          <w:szCs w:val="18"/>
-        </w:rPr>
-        <w:t>wajib</w:t>
-      </w:r>
-      <w:proofErr w:type="spellEnd"/>
-      <w:r>
-        <w:rPr>
-          <w:sz w:val="18"/>
-          <w:szCs w:val="18"/>
-        </w:rPr>
-        <w:t xml:space="preserve"> </w:t>
-      </w:r>
-      <w:proofErr w:type="spellStart"/>
-      <w:r>
-        <w:rPr>
-          <w:sz w:val="18"/>
-          <w:szCs w:val="18"/>
-        </w:rPr>
-        <w:t>dibaca</w:t>
-      </w:r>
-      <w:proofErr w:type="spellEnd"/>
-      <w:r>
-        <w:rPr>
-          <w:sz w:val="18"/>
-          <w:szCs w:val="18"/>
-        </w:rPr>
-        <w:t>).</w:t>
+        <w:t>berlaku</w:t>
+      </w:r>
+      <w:proofErr w:type="spellEnd"/>
+      <w:r>
+        <w:rPr>
+          <w:sz w:val="18"/>
+          <w:szCs w:val="18"/>
+        </w:rPr>
+        <w:t>.</w:t>
       </w:r>
     </w:p>
     <w:p>
@@ -3251,6 +3543,22 @@
           <w:sz w:val="18"/>
           <w:szCs w:val="18"/>
         </w:rPr>
+        <w:t>kehilangan</w:t>
+      </w:r>
+      <w:proofErr w:type="spellEnd"/>
+      <w:r>
+        <w:rPr>
+          <w:sz w:val="18"/>
+          <w:szCs w:val="18"/>
+        </w:rPr>
+        <w:t xml:space="preserve">, </w:t>
+      </w:r>
+      <w:proofErr w:type="spellStart"/>
+      <w:r>
+        <w:rPr>
+          <w:sz w:val="18"/>
+          <w:szCs w:val="18"/>
+        </w:rPr>
         <w:t>pencurian</w:t>
       </w:r>
       <w:proofErr w:type="spellEnd"/>
@@ -3259,6 +3567,118 @@
           <w:sz w:val="18"/>
           <w:szCs w:val="18"/>
         </w:rPr>
+        <w:t xml:space="preserve">, </w:t>
+      </w:r>
+      <w:proofErr w:type="spellStart"/>
+      <w:r>
+        <w:rPr>
+          <w:sz w:val="18"/>
+          <w:szCs w:val="18"/>
+        </w:rPr>
+        <w:t>kerusakan</w:t>
+      </w:r>
+      <w:proofErr w:type="spellEnd"/>
+      <w:r>
+        <w:rPr>
+          <w:sz w:val="18"/>
+          <w:szCs w:val="18"/>
+        </w:rPr>
+        <w:t xml:space="preserve"> </w:t>
+      </w:r>
+      <w:proofErr w:type="spellStart"/>
+      <w:r>
+        <w:rPr>
+          <w:sz w:val="18"/>
+          <w:szCs w:val="18"/>
+        </w:rPr>
+        <w:t>akibat</w:t>
+      </w:r>
+      <w:proofErr w:type="spellEnd"/>
+      <w:r>
+        <w:rPr>
+          <w:sz w:val="18"/>
+          <w:szCs w:val="18"/>
+        </w:rPr>
+        <w:t xml:space="preserve"> </w:t>
+      </w:r>
+      <w:proofErr w:type="spellStart"/>
+      <w:r>
+        <w:rPr>
+          <w:sz w:val="18"/>
+          <w:szCs w:val="18"/>
+        </w:rPr>
+        <w:t>kelalaian</w:t>
+      </w:r>
+      <w:proofErr w:type="spellEnd"/>
+      <w:r>
+        <w:rPr>
+          <w:sz w:val="18"/>
+          <w:szCs w:val="18"/>
+        </w:rPr>
+        <w:t xml:space="preserve">, </w:t>
+      </w:r>
+      <w:proofErr w:type="spellStart"/>
+      <w:r>
+        <w:rPr>
+          <w:sz w:val="18"/>
+          <w:szCs w:val="18"/>
+        </w:rPr>
+        <w:t>atau</w:t>
+      </w:r>
+      <w:proofErr w:type="spellEnd"/>
+      <w:r>
+        <w:rPr>
+          <w:sz w:val="18"/>
+          <w:szCs w:val="18"/>
+        </w:rPr>
+        <w:t xml:space="preserve"> </w:t>
+      </w:r>
+      <w:proofErr w:type="spellStart"/>
+      <w:r>
+        <w:rPr>
+          <w:sz w:val="18"/>
+          <w:szCs w:val="18"/>
+        </w:rPr>
+        <w:t>penyalahgunaan</w:t>
+      </w:r>
+      <w:proofErr w:type="spellEnd"/>
+      <w:r>
+        <w:rPr>
+          <w:sz w:val="18"/>
+          <w:szCs w:val="18"/>
+        </w:rPr>
+        <w:t xml:space="preserve"> </w:t>
+      </w:r>
+      <w:proofErr w:type="spellStart"/>
+      <w:r>
+        <w:rPr>
+          <w:sz w:val="18"/>
+          <w:szCs w:val="18"/>
+        </w:rPr>
+        <w:t>terhadap</w:t>
+      </w:r>
+      <w:proofErr w:type="spellEnd"/>
+      <w:r>
+        <w:rPr>
+          <w:sz w:val="18"/>
+          <w:szCs w:val="18"/>
+        </w:rPr>
+        <w:t xml:space="preserve"> </w:t>
+      </w:r>
+      <w:proofErr w:type="spellStart"/>
+      <w:r>
+        <w:rPr>
+          <w:sz w:val="18"/>
+          <w:szCs w:val="18"/>
+        </w:rPr>
+        <w:t>barang</w:t>
+      </w:r>
+      <w:proofErr w:type="spellEnd"/>
+      <w:r>
+        <w:rPr>
+          <w:sz w:val="18"/>
+          <w:szCs w:val="18"/>
+        </w:rPr>
         <w:t>/</w:t>
       </w:r>
       <w:proofErr w:type="spellStart"/>
@@ -3267,7 +3687,39 @@
           <w:sz w:val="18"/>
           <w:szCs w:val="18"/>
         </w:rPr>
-        <w:t>kehilangan</w:t>
+        <w:t>peralatan</w:t>
+      </w:r>
+      <w:proofErr w:type="spellEnd"/>
+      <w:r>
+        <w:rPr>
+          <w:sz w:val="18"/>
+          <w:szCs w:val="18"/>
+        </w:rPr>
+        <w:t xml:space="preserve"> yang </w:t>
+      </w:r>
+      <w:proofErr w:type="spellStart"/>
+      <w:r>
+        <w:rPr>
+          <w:sz w:val="18"/>
+          <w:szCs w:val="18"/>
+        </w:rPr>
+        <w:t>diserahkan</w:t>
+      </w:r>
+      <w:proofErr w:type="spellEnd"/>
+      <w:r>
+        <w:rPr>
+          <w:sz w:val="18"/>
+          <w:szCs w:val="18"/>
+        </w:rPr>
+        <w:t xml:space="preserve">, </w:t>
+      </w:r>
+      <w:proofErr w:type="spellStart"/>
+      <w:r>
+        <w:rPr>
+          <w:sz w:val="18"/>
+          <w:szCs w:val="18"/>
+        </w:rPr>
+        <w:t>maka</w:t>
       </w:r>
       <w:proofErr w:type="spellEnd"/>
       <w:r>
@@ -3283,7 +3735,190 @@
           <w:sz w:val="18"/>
           <w:szCs w:val="18"/>
         </w:rPr>
-        <w:t>perangkat</w:t>
+        <w:t>pihak</w:t>
+      </w:r>
+      <w:proofErr w:type="spellEnd"/>
+      <w:r>
+        <w:rPr>
+          <w:sz w:val="18"/>
+          <w:szCs w:val="18"/>
+        </w:rPr>
+        <w:t xml:space="preserve"> </w:t>
+      </w:r>
+      <w:proofErr w:type="spellStart"/>
+      <w:r>
+        <w:rPr>
+          <w:sz w:val="18"/>
+          <w:szCs w:val="18"/>
+        </w:rPr>
+        <w:t>penerima</w:t>
+      </w:r>
+      <w:proofErr w:type="spellEnd"/>
+      <w:r>
+        <w:rPr>
+          <w:sz w:val="18"/>
+          <w:szCs w:val="18"/>
+        </w:rPr>
+        <w:t xml:space="preserve"> </w:t>
+      </w:r>
+      <w:proofErr w:type="spellStart"/>
+      <w:r>
+        <w:rPr>
+          <w:sz w:val="18"/>
+          <w:szCs w:val="18"/>
+        </w:rPr>
+        <w:t>wajib</w:t>
+      </w:r>
+      <w:proofErr w:type="spellEnd"/>
+      <w:r>
+        <w:rPr>
+          <w:sz w:val="18"/>
+          <w:szCs w:val="18"/>
+        </w:rPr>
+        <w:t xml:space="preserve"> </w:t>
+      </w:r>
+      <w:proofErr w:type="spellStart"/>
+      <w:r>
+        <w:rPr>
+          <w:sz w:val="18"/>
+          <w:szCs w:val="18"/>
+        </w:rPr>
+        <w:t>segera</w:t>
+      </w:r>
+      <w:proofErr w:type="spellEnd"/>
+      <w:r>
+        <w:rPr>
+          <w:sz w:val="18"/>
+          <w:szCs w:val="18"/>
+        </w:rPr>
+        <w:t xml:space="preserve"> </w:t>
+      </w:r>
+      <w:proofErr w:type="spellStart"/>
+      <w:r>
+        <w:rPr>
+          <w:sz w:val="18"/>
+          <w:szCs w:val="18"/>
+        </w:rPr>
+        <w:t>melaporkan</w:t>
+      </w:r>
+      <w:r>
+        <w:rPr>
+          <w:sz w:val="18"/>
+          <w:szCs w:val="18"/>
+        </w:rPr>
+        <w:t>nya</w:t>
+      </w:r>
+      <w:proofErr w:type="spellEnd"/>
+      <w:r>
+        <w:rPr>
+          <w:sz w:val="18"/>
+          <w:szCs w:val="18"/>
+        </w:rPr>
+        <w:t xml:space="preserve"> </w:t>
+      </w:r>
+      <w:proofErr w:type="spellStart"/>
+      <w:r>
+        <w:rPr>
+          <w:sz w:val="18"/>
+          <w:szCs w:val="18"/>
+        </w:rPr>
+        <w:t>kepada</w:t>
+      </w:r>
+      <w:proofErr w:type="spellEnd"/>
+      <w:r>
+        <w:rPr>
+          <w:sz w:val="18"/>
+          <w:szCs w:val="18"/>
+        </w:rPr>
+        <w:t xml:space="preserve"> </w:t>
+      </w:r>
+      <w:proofErr w:type="spellStart"/>
+      <w:r>
+        <w:rPr>
+          <w:sz w:val="18"/>
+          <w:szCs w:val="18"/>
+        </w:rPr>
+        <w:t>atasan</w:t>
+      </w:r>
+      <w:proofErr w:type="spellEnd"/>
+      <w:r>
+        <w:rPr>
+          <w:sz w:val="18"/>
+          <w:szCs w:val="18"/>
+        </w:rPr>
+        <w:t xml:space="preserve"> </w:t>
+      </w:r>
+      <w:proofErr w:type="spellStart"/>
+      <w:r>
+        <w:rPr>
+          <w:sz w:val="18"/>
+          <w:szCs w:val="18"/>
+        </w:rPr>
+        <w:t>langsung</w:t>
+      </w:r>
+      <w:proofErr w:type="spellEnd"/>
+      <w:r>
+        <w:rPr>
+          <w:sz w:val="18"/>
+          <w:szCs w:val="18"/>
+        </w:rPr>
+        <w:t xml:space="preserve">, </w:t>
+      </w:r>
+      <w:proofErr w:type="spellStart"/>
+      <w:r>
+        <w:rPr>
+          <w:sz w:val="18"/>
+          <w:szCs w:val="18"/>
+        </w:rPr>
+        <w:t>fungsi</w:t>
+      </w:r>
+      <w:proofErr w:type="spellEnd"/>
+      <w:r>
+        <w:rPr>
+          <w:sz w:val="18"/>
+          <w:szCs w:val="18"/>
+        </w:rPr>
+        <w:t xml:space="preserve"> </w:t>
+      </w:r>
+      <w:proofErr w:type="spellStart"/>
+      <w:r>
+        <w:rPr>
+          <w:sz w:val="18"/>
+          <w:szCs w:val="18"/>
+        </w:rPr>
+        <w:t>terkait</w:t>
+      </w:r>
+      <w:proofErr w:type="spellEnd"/>
+      <w:r>
+        <w:rPr>
+          <w:sz w:val="18"/>
+          <w:szCs w:val="18"/>
+        </w:rPr>
+        <w:t xml:space="preserve">, </w:t>
+      </w:r>
+      <w:proofErr w:type="spellStart"/>
+      <w:r>
+        <w:rPr>
+          <w:sz w:val="18"/>
+          <w:szCs w:val="18"/>
+        </w:rPr>
+        <w:t>serta</w:t>
+      </w:r>
+      <w:proofErr w:type="spellEnd"/>
+      <w:r>
+        <w:rPr>
+          <w:sz w:val="18"/>
+          <w:szCs w:val="18"/>
+        </w:rPr>
+        <w:t xml:space="preserve"> </w:t>
+      </w:r>
+      <w:proofErr w:type="spellStart"/>
+      <w:r>
+        <w:rPr>
+          <w:sz w:val="18"/>
+          <w:szCs w:val="18"/>
+        </w:rPr>
+        <w:t>pihak</w:t>
       </w:r>
       <w:proofErr w:type="spellEnd"/>
       <w:r>
@@ -3299,7 +3934,7 @@
           <w:sz w:val="18"/>
           <w:szCs w:val="18"/>
         </w:rPr>
-        <w:t>diserahkan</w:t>
+        <w:t>berwenang</w:t>
       </w:r>
       <w:proofErr w:type="spellEnd"/>
       <w:r>
@@ -3315,7 +3950,7 @@
           <w:sz w:val="18"/>
           <w:szCs w:val="18"/>
         </w:rPr>
-        <w:t>kepada</w:t>
+        <w:t>sesuai</w:t>
       </w:r>
       <w:proofErr w:type="spellEnd"/>
       <w:r>
@@ -3331,23 +3966,7 @@
           <w:sz w:val="18"/>
           <w:szCs w:val="18"/>
         </w:rPr>
-        <w:t>pemakai</w:t>
-      </w:r>
-      <w:proofErr w:type="spellEnd"/>
-      <w:r>
-        <w:rPr>
-          <w:sz w:val="18"/>
-          <w:szCs w:val="18"/>
-        </w:rPr>
-        <w:t>/</w:t>
-      </w:r>
-      <w:proofErr w:type="spellStart"/>
-      <w:r>
-        <w:rPr>
-          <w:sz w:val="18"/>
-          <w:szCs w:val="18"/>
-        </w:rPr>
-        <w:t>penanggung</w:t>
+        <w:t>dengan</w:t>
       </w:r>
       <w:proofErr w:type="spellEnd"/>
       <w:r>
@@ -3363,255 +3982,15 @@
           <w:sz w:val="18"/>
           <w:szCs w:val="18"/>
         </w:rPr>
-        <w:t>jawab</w:t>
-      </w:r>
-      <w:proofErr w:type="spellEnd"/>
-      <w:r>
-        <w:rPr>
-          <w:sz w:val="18"/>
-          <w:szCs w:val="18"/>
-        </w:rPr>
-        <w:t xml:space="preserve">, </w:t>
-      </w:r>
-      <w:proofErr w:type="spellStart"/>
-      <w:r>
-        <w:rPr>
-          <w:sz w:val="18"/>
-          <w:szCs w:val="18"/>
-        </w:rPr>
-        <w:t>maka</w:t>
-      </w:r>
-      <w:proofErr w:type="spellEnd"/>
-      <w:r>
-        <w:rPr>
-          <w:sz w:val="18"/>
-          <w:szCs w:val="18"/>
-        </w:rPr>
-        <w:t xml:space="preserve"> </w:t>
-      </w:r>
-      <w:proofErr w:type="spellStart"/>
-      <w:r>
-        <w:rPr>
-          <w:sz w:val="18"/>
-          <w:szCs w:val="18"/>
-        </w:rPr>
-        <w:t>pemakai</w:t>
-      </w:r>
-      <w:proofErr w:type="spellEnd"/>
-      <w:r>
-        <w:rPr>
-          <w:sz w:val="18"/>
-          <w:szCs w:val="18"/>
-        </w:rPr>
-        <w:t>/</w:t>
-      </w:r>
-      <w:proofErr w:type="spellStart"/>
-      <w:r>
-        <w:rPr>
-          <w:sz w:val="18"/>
-          <w:szCs w:val="18"/>
-        </w:rPr>
-        <w:t>penanggung</w:t>
-      </w:r>
-      <w:proofErr w:type="spellEnd"/>
-      <w:r>
-        <w:rPr>
-          <w:sz w:val="18"/>
-          <w:szCs w:val="18"/>
-        </w:rPr>
-        <w:t xml:space="preserve"> </w:t>
-      </w:r>
-      <w:proofErr w:type="spellStart"/>
-      <w:r>
-        <w:rPr>
-          <w:sz w:val="18"/>
-          <w:szCs w:val="18"/>
-        </w:rPr>
-        <w:t>jawab</w:t>
-      </w:r>
-      <w:proofErr w:type="spellEnd"/>
-      <w:r>
-        <w:rPr>
-          <w:sz w:val="18"/>
-          <w:szCs w:val="18"/>
-        </w:rPr>
-        <w:t xml:space="preserve"> </w:t>
-      </w:r>
-      <w:proofErr w:type="spellStart"/>
-      <w:r>
-        <w:rPr>
-          <w:sz w:val="18"/>
-          <w:szCs w:val="18"/>
-        </w:rPr>
-        <w:t>harus</w:t>
-      </w:r>
-      <w:proofErr w:type="spellEnd"/>
-      <w:r>
-        <w:rPr>
-          <w:sz w:val="18"/>
-          <w:szCs w:val="18"/>
-        </w:rPr>
-        <w:t xml:space="preserve"> </w:t>
-      </w:r>
-      <w:proofErr w:type="spellStart"/>
-      <w:r>
-        <w:rPr>
-          <w:sz w:val="18"/>
-          <w:szCs w:val="18"/>
-        </w:rPr>
-        <w:t>melaporkan</w:t>
-      </w:r>
-      <w:proofErr w:type="spellEnd"/>
-      <w:r>
-        <w:rPr>
-          <w:sz w:val="18"/>
-          <w:szCs w:val="18"/>
-        </w:rPr>
-        <w:t xml:space="preserve"> </w:t>
-      </w:r>
-      <w:proofErr w:type="spellStart"/>
-      <w:r>
-        <w:rPr>
-          <w:sz w:val="18"/>
-          <w:szCs w:val="18"/>
-        </w:rPr>
-        <w:t>kepada</w:t>
-      </w:r>
-      <w:proofErr w:type="spellEnd"/>
-      <w:r>
-        <w:rPr>
-          <w:sz w:val="18"/>
-          <w:szCs w:val="18"/>
-        </w:rPr>
-        <w:t xml:space="preserve"> </w:t>
-      </w:r>
-      <w:proofErr w:type="spellStart"/>
-      <w:r>
-        <w:rPr>
-          <w:sz w:val="18"/>
-          <w:szCs w:val="18"/>
-        </w:rPr>
-        <w:t>Kepolisian</w:t>
-      </w:r>
-      <w:proofErr w:type="spellEnd"/>
-      <w:r>
-        <w:rPr>
-          <w:sz w:val="18"/>
-          <w:szCs w:val="18"/>
-        </w:rPr>
-        <w:t xml:space="preserve"> dan </w:t>
-      </w:r>
-      <w:proofErr w:type="spellStart"/>
-      <w:r>
-        <w:rPr>
-          <w:sz w:val="18"/>
-          <w:szCs w:val="18"/>
-        </w:rPr>
-        <w:t>Sekuriti</w:t>
-      </w:r>
-      <w:proofErr w:type="spellEnd"/>
-      <w:r>
-        <w:rPr>
-          <w:sz w:val="18"/>
-          <w:szCs w:val="18"/>
-        </w:rPr>
-        <w:t xml:space="preserve"> PERTAMINA </w:t>
-      </w:r>
-      <w:proofErr w:type="spellStart"/>
-      <w:r>
-        <w:rPr>
-          <w:sz w:val="18"/>
-          <w:szCs w:val="18"/>
-        </w:rPr>
-        <w:t>dimana</w:t>
-      </w:r>
-      <w:proofErr w:type="spellEnd"/>
-      <w:r>
-        <w:rPr>
-          <w:sz w:val="18"/>
-          <w:szCs w:val="18"/>
-        </w:rPr>
-        <w:t xml:space="preserve"> </w:t>
-      </w:r>
-      <w:proofErr w:type="spellStart"/>
-      <w:r>
-        <w:rPr>
-          <w:sz w:val="18"/>
-          <w:szCs w:val="18"/>
-        </w:rPr>
-        <w:t>terjadi</w:t>
-      </w:r>
-      <w:proofErr w:type="spellEnd"/>
-      <w:r>
-        <w:rPr>
-          <w:sz w:val="18"/>
-          <w:szCs w:val="18"/>
-        </w:rPr>
-        <w:t xml:space="preserve"> </w:t>
-      </w:r>
-      <w:proofErr w:type="spellStart"/>
-      <w:r>
-        <w:rPr>
-          <w:sz w:val="18"/>
-          <w:szCs w:val="18"/>
-        </w:rPr>
-        <w:t>pencurian</w:t>
-      </w:r>
-      <w:proofErr w:type="spellEnd"/>
-      <w:r>
-        <w:rPr>
-          <w:sz w:val="18"/>
-          <w:szCs w:val="18"/>
-        </w:rPr>
-        <w:t>/</w:t>
-      </w:r>
-      <w:proofErr w:type="spellStart"/>
-      <w:r>
-        <w:rPr>
-          <w:sz w:val="18"/>
-          <w:szCs w:val="18"/>
-        </w:rPr>
-        <w:t>kehilangan</w:t>
-      </w:r>
-      <w:proofErr w:type="spellEnd"/>
-      <w:r>
-        <w:rPr>
-          <w:sz w:val="18"/>
-          <w:szCs w:val="18"/>
-        </w:rPr>
-        <w:t xml:space="preserve"> </w:t>
-      </w:r>
-      <w:proofErr w:type="spellStart"/>
-      <w:r>
-        <w:rPr>
-          <w:sz w:val="18"/>
-          <w:szCs w:val="18"/>
-        </w:rPr>
-        <w:t>barang</w:t>
-      </w:r>
-      <w:proofErr w:type="spellEnd"/>
-      <w:r>
-        <w:rPr>
-          <w:sz w:val="18"/>
-          <w:szCs w:val="18"/>
-        </w:rPr>
-        <w:t xml:space="preserve"> </w:t>
-      </w:r>
-      <w:proofErr w:type="spellStart"/>
-      <w:r>
-        <w:rPr>
-          <w:sz w:val="18"/>
-          <w:szCs w:val="18"/>
-        </w:rPr>
-        <w:t>tersebut</w:t>
-      </w:r>
-      <w:proofErr w:type="spellEnd"/>
-      <w:r>
-        <w:rPr>
-          <w:sz w:val="18"/>
-          <w:szCs w:val="18"/>
-        </w:rPr>
-        <w:t xml:space="preserve">. </w:t>
+        <w:t>ketentuan</w:t>
+      </w:r>
+      <w:proofErr w:type="spellEnd"/>
+      <w:r>
+        <w:rPr>
+          <w:sz w:val="18"/>
+          <w:szCs w:val="18"/>
+        </w:rPr>
+        <w:t xml:space="preserve"> Perusahaan. </w:t>
       </w:r>
       <w:r>
         <w:rPr>
@@ -3619,7 +3998,7 @@
           <w:szCs w:val="18"/>
           <w:lang w:val="nb-NO"/>
         </w:rPr>
-        <w:t>Laporan tsb akan diproses oleh pihak berwenang sesuai dengan peraturan yang berlaku.</w:t>
+        <w:t>Proses penanganan akan dilakukan sesuai dengan peraturan dan kebijakan yang berlaku.</w:t>
       </w:r>
     </w:p>
     <w:p>
@@ -3657,28 +4036,7 @@
           <w:szCs w:val="18"/>
           <w:lang w:val="nb-NO"/>
         </w:rPr>
-        <w:t>Perangkat Notebook yang dipinjamkan adalah milik PT Pertamina Patra Niaga Regional Sumbagsel. Jika terjadi pencurian/kehilangan selama masa peminjaman maka Perusahaan tidak wajib memberikan pengganti notebook dan pekerja wajib menyediakan notebook pengganti sesuai spesifikasi hardware, software, OS yang ditentukan Perusahaan. Perangkat pengganti tetap akan dikelola oleh Perusahaan.</w:t>
-      </w:r>
-    </w:p>
-    <w:p>
-      <w:pPr>
-        <w:pStyle w:val="ListParagraph"/>
-        <w:spacing w:after="120" w:line="276" w:lineRule="auto"/>
-        <w:ind w:left="360"/>
-        <w:jc w:val="both"/>
-        <w:rPr>
-          <w:sz w:val="18"/>
-          <w:szCs w:val="18"/>
-          <w:lang w:val="nb-NO"/>
-        </w:rPr>
-      </w:pPr>
-      <w:r>
-        <w:rPr>
-          <w:sz w:val="18"/>
-          <w:szCs w:val="18"/>
-          <w:lang w:val="nb-NO"/>
-        </w:rPr>
-        <w:t>Notebook peminjaman akan ditarik oleh Perusahaan apabila Pekerja yang bersangkutan berstatus Pemutusan Hubungan Kerja/Resign/Pensiun Dini atau akan menjalani MPPK dalam jangka waktu kurang dari 3 bulan atau 9 bulan sebelum Pensiun dengan Perusahaan selama masa peminjaman.</w:t>
+        <w:t>Barang/peralatan yang dialokasikan/dipinjamkan merupakan aset milik PT Pertamina Patra Niaga Regional Sumbagsel. Selama masa peminjaman, pihak penerima bertanggung jawab atas keamanan, penggunaan, pemeliharaan, dan kondisi barang/peralatan tersebut. Apabila terjadi kehilangan atau kerusakan akibat kelalaian penerima, maka penyelesaian dan penggantian akan dilakukan sesuai dengan ketentuan Perusahaan. Barang/peralatan yang dipinjamkan tetap menjadi milik Perusahaan dan wajib dikembalikan dalam kondisi baik ketika masa peminjaman berakhir atau apabila diminta kembali oleh Perusahaan.</w:t>
       </w:r>
     </w:p>
     <w:p>
@@ -3716,15 +4074,7 @@
           <w:szCs w:val="18"/>
           <w:lang w:val="nb-NO"/>
         </w:rPr>
-        <w:t>Telah dilakukan uji-coba terhadap perangkat-keras dan perangkat-lunak yang terpasang tersebut di atas yang dilaksanakan oleh petugas dari IT Sumbagsel dan pihak penerima sebagai pemakai/penanggung jawab, semua sepakat bahwa semua peralatan tersebut telah sesuai seperti tercantum di atas dan bekerja dengan baik serta laik pakai, sebagai berikut</w:t>
-      </w:r>
-      <w:r>
-        <w:rPr>
-          <w:sz w:val="18"/>
-          <w:szCs w:val="18"/>
-          <w:lang w:val="nb-NO"/>
-        </w:rPr>
-        <w:t>:</w:t>
+        <w:t>Barang/peralatan yang diserahterimakan telah diperiksa dan/atau diuji fungsinya oleh petugas yang berwenang bersama pihak penerima. Dengan ditandatanganinya Berita Acara Serah Terima ini, pihak penerima menyatakan bahwa barang/peralatan telah diterima dalam kondisi baik, lengkap, berfungsi sebagaimana mestinya, serta sesuai dengan spesifikasi yang tercantum dalam dokumen ini.</w:t>
       </w:r>
     </w:p>
     <w:p>
@@ -3734,6 +4084,8 @@
         <w:ind w:left="360"/>
         <w:jc w:val="both"/>
         <w:rPr>
+          <w:sz w:val="18"/>
+          <w:szCs w:val="18"/>
           <w:lang w:val="nb-NO"/>
         </w:rPr>
       </w:pPr>
@@ -3760,7 +4112,136 @@
           <w:szCs w:val="18"/>
           <w:lang w:val="nb-NO"/>
         </w:rPr>
-        <w:t>Kami sebagai Penerima/Penanggung Jawab telah membaca, memahami, dan menerima semua ketentuan Perusahaan tersebut.</w:t>
+        <w:lastRenderedPageBreak/>
+        <w:t>Pihak penerima tidak diperkenankan memindahtangankan, meminjamkan, menjual, mengubah konfigurasi, atau menggunakan barang/peralatan di luar kepentingan pekerjaan tanpa persetujuan</w:t>
+      </w:r>
+      <w:r>
+        <w:rPr>
+          <w:sz w:val="18"/>
+          <w:szCs w:val="18"/>
+          <w:lang w:val="nb-NO"/>
+        </w:rPr>
+        <w:t xml:space="preserve"> </w:t>
+      </w:r>
+      <w:r>
+        <w:rPr>
+          <w:sz w:val="18"/>
+          <w:szCs w:val="18"/>
+          <w:lang w:val="nb-NO"/>
+        </w:rPr>
+        <w:t>Perusahaan atau fungsi yang berwenang.</w:t>
+      </w:r>
+    </w:p>
+    <w:p>
+      <w:pPr>
+        <w:pStyle w:val="ListParagraph"/>
+        <w:spacing w:after="120" w:line="276" w:lineRule="auto"/>
+        <w:ind w:left="360"/>
+        <w:jc w:val="both"/>
+        <w:rPr>
+          <w:sz w:val="18"/>
+          <w:szCs w:val="18"/>
+          <w:lang w:val="nb-NO"/>
+        </w:rPr>
+      </w:pPr>
+    </w:p>
+    <w:p>
+      <w:pPr>
+        <w:pStyle w:val="ListParagraph"/>
+        <w:numPr>
+          <w:ilvl w:val="0"/>
+          <w:numId w:val="1"/>
+        </w:numPr>
+        <w:spacing w:after="120" w:line="276" w:lineRule="auto"/>
+        <w:ind w:left="360" w:hanging="180"/>
+        <w:jc w:val="both"/>
+        <w:rPr>
+          <w:bCs/>
+          <w:sz w:val="18"/>
+          <w:szCs w:val="18"/>
+          <w:lang w:val="nb-NO"/>
+        </w:rPr>
+      </w:pPr>
+      <w:r>
+        <w:rPr>
+          <w:bCs/>
+          <w:sz w:val="18"/>
+          <w:szCs w:val="18"/>
+          <w:lang w:val="nb-NO"/>
+        </w:rPr>
+        <w:t xml:space="preserve">Kami sebagai </w:t>
+      </w:r>
+      <w:r>
+        <w:rPr>
+          <w:bCs/>
+          <w:sz w:val="18"/>
+          <w:szCs w:val="18"/>
+          <w:lang w:val="nb-NO"/>
+        </w:rPr>
+        <w:t>p</w:t>
+      </w:r>
+      <w:r>
+        <w:rPr>
+          <w:bCs/>
+          <w:sz w:val="18"/>
+          <w:szCs w:val="18"/>
+          <w:lang w:val="nb-NO"/>
+        </w:rPr>
+        <w:t>enerima/</w:t>
+      </w:r>
+      <w:r>
+        <w:rPr>
+          <w:bCs/>
+          <w:sz w:val="18"/>
+          <w:szCs w:val="18"/>
+          <w:lang w:val="nb-NO"/>
+        </w:rPr>
+        <w:t>p</w:t>
+      </w:r>
+      <w:r>
+        <w:rPr>
+          <w:bCs/>
+          <w:sz w:val="18"/>
+          <w:szCs w:val="18"/>
+          <w:lang w:val="nb-NO"/>
+        </w:rPr>
+        <w:t xml:space="preserve">enanggung </w:t>
+      </w:r>
+      <w:r>
+        <w:rPr>
+          <w:bCs/>
+          <w:sz w:val="18"/>
+          <w:szCs w:val="18"/>
+          <w:lang w:val="nb-NO"/>
+        </w:rPr>
+        <w:t>j</w:t>
+      </w:r>
+      <w:r>
+        <w:rPr>
+          <w:bCs/>
+          <w:sz w:val="18"/>
+          <w:szCs w:val="18"/>
+          <w:lang w:val="nb-NO"/>
+        </w:rPr>
+        <w:t>awab telah membaca, memahami, dan menerima semua ketentuan Perusahaa</w:t>
+      </w:r>
+      <w:r>
+        <w:rPr>
+          <w:bCs/>
+          <w:sz w:val="18"/>
+          <w:szCs w:val="18"/>
+          <w:lang w:val="nb-NO"/>
+        </w:rPr>
+        <w:t>n</w:t>
+      </w:r>
+      <w:r>
+        <w:rPr>
+          <w:bCs/>
+          <w:sz w:val="18"/>
+          <w:szCs w:val="18"/>
+          <w:lang w:val="nb-NO"/>
+        </w:rPr>
+        <w:t>.</w:t>
       </w:r>
     </w:p>
     <w:p>
@@ -3802,21 +4283,47 @@
         </w:rPr>
       </w:pPr>
     </w:p>
+    <w:p>
+      <w:pPr>
+        <w:pStyle w:val="ListParagraph"/>
+        <w:spacing w:after="120" w:line="276" w:lineRule="auto"/>
+        <w:ind w:left="360"/>
+        <w:jc w:val="both"/>
+        <w:rPr>
+          <w:sz w:val="18"/>
+          <w:szCs w:val="18"/>
+          <w:lang w:val="nb-NO"/>
+        </w:rPr>
+      </w:pPr>
+    </w:p>
+    <w:p>
+      <w:pPr>
+        <w:pStyle w:val="ListParagraph"/>
+        <w:spacing w:after="120" w:line="276" w:lineRule="auto"/>
+        <w:ind w:left="360"/>
+        <w:jc w:val="both"/>
+        <w:rPr>
+          <w:sz w:val="18"/>
+          <w:szCs w:val="18"/>
+          <w:lang w:val="nb-NO"/>
+        </w:rPr>
+      </w:pPr>
+    </w:p>
     <w:tbl>
       <w:tblPr>
         <w:tblStyle w:val="TableGrid"/>
         <w:tblW w:w="0" w:type="auto"/>
         <w:tblInd w:w="360" w:type="dxa"/>
-        <w:tblBorders>
-          <w:top w:val="none" w:color="auto" w:sz="0" w:space="0"/>
-          <w:left w:val="none" w:color="auto" w:sz="0" w:space="0"/>
-          <w:bottom w:val="none" w:color="auto" w:sz="0" w:space="0"/>
-          <w:right w:val="none" w:color="auto" w:sz="0" w:space="0"/>
-          <w:insideH w:val="none" w:color="auto" w:sz="0" w:space="0"/>
-          <w:insideV w:val="none" w:color="auto" w:sz="0" w:space="0"/>
-        </w:tblBorders>
         <w:tblLook w:val="04A0" w:firstRow="1" w:lastRow="0" w:firstColumn="1" w:lastColumn="0" w:noHBand="0" w:noVBand="1"/>
         <w:tblLayout w:type="fixed"/>
+        <w:tblBorders>
+          <w:top w:val="nil"/>
+          <w:left w:val="nil"/>
+          <w:bottom w:val="nil"/>
+          <w:right w:val="nil"/>
+          <w:insideH w:val="nil"/>
+          <w:insideV w:val="nil"/>
+        </w:tblBorders>
       </w:tblPr>
       <w:tblGrid>
         <w:gridCol w:w="3096"/>
@@ -3839,6 +4346,18 @@
                 <w:lang w:val="nb-NO"/>
               </w:rPr>
             </w:pPr>
+          </w:p>
+          <w:p>
+            <w:pPr>
+              <w:pStyle w:val="ListParagraph"/>
+              <w:ind w:left="0"/>
+              <w:rPr>
+                <w:noProof/>
+                <w:sz w:val="18"/>
+                <w:szCs w:val="18"/>
+                <w:lang w:val="nb-NO"/>
+              </w:rPr>
+            </w:pPr>
             <w:r>
               <w:rPr>
                 <w:noProof/>
@@ -3865,15 +4384,6 @@
                 <w:lang w:val="nb-NO"/>
               </w:rPr>
             </w:pPr>
-            <w:r>
-              <w:rPr>
-                <w:noProof/>
-                <w:sz w:val="18"/>
-                <w:szCs w:val="18"/>
-                <w:lang w:val="nb-NO"/>
-              </w:rPr>
-              <w:t>Yang Mengetahui,</w:t>
-            </w:r>
           </w:p>
           <w:p>
             <w:pPr>
@@ -3893,7 +4403,46 @@
                 <w:szCs w:val="18"/>
                 <w:lang w:val="nb-NO"/>
               </w:rPr>
+              <w:t>Yang Mengetahui,</w:t>
+            </w:r>
+          </w:p>
+          <w:p>
+            <w:pPr>
+              <w:pStyle w:val="ListParagraph"/>
+              <w:ind w:left="0"/>
+              <w:rPr>
+                <w:noProof/>
+                <w:sz w:val="18"/>
+                <w:szCs w:val="18"/>
+                <w:lang w:val="nb-NO"/>
+              </w:rPr>
+            </w:pPr>
+            <w:r>
+              <w:rPr>
+                <w:noProof/>
+                <w:sz w:val="18"/>
+                <w:szCs w:val="18"/>
+                <w:lang w:val="nb-NO"/>
+              </w:rPr>
               <w:t>Inspector II Reliability</w:t>
+            </w:r>
+            <w:r>
+              <w:rPr>
+                <w:noProof/>
+                <w:sz w:val="18"/>
+                <w:szCs w:val="18"/>
+                <w:lang w:val="nb-NO"/>
+              </w:rPr>
+              <w:t/>
+            </w:r>
+            <w:r>
+              <w:rPr>
+                <w:noProof/>
+                <w:sz w:val="18"/>
+                <w:szCs w:val="18"/>
+                <w:lang w:val="nb-NO"/>
+              </w:rPr>
+              <w:t/>
             </w:r>
           </w:p>
         </w:tc>
@@ -3919,7 +4468,7 @@
                 <w:szCs w:val="18"/>
                 <w:lang w:val="nb-NO"/>
               </w:rPr>
-              <w:t>Palembang, 29 Juni 2026</w:t>
+              <w:t>Palembang, 05 Juli 2026</w:t>
             </w:r>
           </w:p>
           <w:p>
@@ -3942,6 +4491,18 @@
               </w:rPr>
               <w:t>Yang Menerima,</w:t>
             </w:r>
+          </w:p>
+          <w:p>
+            <w:pPr>
+              <w:pStyle w:val="ListParagraph"/>
+              <w:ind w:left="0"/>
+              <w:rPr>
+                <w:noProof/>
+                <w:sz w:val="18"/>
+                <w:szCs w:val="18"/>
+                <w:lang w:val="nb-NO"/>
+              </w:rPr>
+            </w:pPr>
           </w:p>
         </w:tc>
       </w:tr>
@@ -3961,7 +4522,7 @@
                 <wp:inline distT="0" distB="0" distL="0" distR="0">
                   <wp:extent cx="1778000" cy="703288"/>
                   <wp:effectExtent l="0" t="0" r="0" b="0"/>
-                  <wp:docPr id="500" name="signature"/>
+                  <wp:docPr id="90170" name="signature"/>
                   <wp:cNvGraphicFramePr>
                     <a:graphicFrameLocks noChangeAspect="1"/>
                   </wp:cNvGraphicFramePr>
@@ -3969,11 +4530,11 @@
                     <a:graphicData uri="http://schemas.openxmlformats.org/drawingml/2006/picture">
                       <pic:pic>
                         <pic:nvPicPr>
-                          <pic:cNvPr id="0" name="sig.png"/>
+                          <pic:cNvPr id="90171" name="sig.png"/>
                           <pic:cNvPicPr/>
                         </pic:nvPicPr>
                         <pic:blipFill>
-                          <a:blip r:embed="R80c8f713fc6d493c"/>
+                          <a:blip r:embed="R3719e5edb17b46a4"/>
                           <a:stretch>
                             <a:fillRect/>
                           </a:stretch>
@@ -3994,6 +4555,30 @@
               </w:drawing>
             </w:r>
           </w:p>
+          <w:p>
+            <w:pPr>
+              <w:pStyle w:val="ListParagraph"/>
+              <w:ind w:left="0"/>
+              <w:rPr>
+                <w:b/>
+                <w:bCs/>
+                <w:noProof/>
+                <w:sz w:val="18"/>
+                <w:szCs w:val="18"/>
+                <w:u w:val="single"/>
+                <w:lang w:val="nb-NO"/>
+              </w:rPr>
+            </w:pPr>
+            <w:r>
+              <w:rPr>
+                <w:sz w:val="18"/>
+                <w:szCs w:val="18"/>
+                <w:u w:val="single"/>
+                <w:lang w:val="nb-NO"/>
+              </w:rPr>
+              <w:t>Bucky Barnes</w:t>
+            </w:r>
+          </w:p>
         </w:tc>
         <w:tc>
           <w:tcPr>
@@ -4001,46 +4586,74 @@
           </w:tcPr>
           <w:p>
             <w:pPr>
+              <w:pStyle w:val="ListParagraph"/>
               <w:ind w:left="0"/>
-              <w:jc w:val="left"/>
-              <w:spacing w:after="300"/>
-            </w:pPr>
-            <w:r>
-              <w:drawing>
-                <wp:inline distT="0" distB="0" distL="0" distR="0">
-                  <wp:extent cx="1778000" cy="703288"/>
-                  <wp:effectExtent l="0" t="0" r="0" b="0"/>
-                  <wp:docPr id="500" name="signature"/>
-                  <wp:cNvGraphicFramePr>
-                    <a:graphicFrameLocks noChangeAspect="1"/>
-                  </wp:cNvGraphicFramePr>
-                  <a:graphic>
-                    <a:graphicData uri="http://schemas.openxmlformats.org/drawingml/2006/picture">
-                      <pic:pic>
-                        <pic:nvPicPr>
-                          <pic:cNvPr id="0" name="sig.png"/>
-                          <pic:cNvPicPr/>
-                        </pic:nvPicPr>
-                        <pic:blipFill>
-                          <a:blip r:embed="Rb79cd3dea71a47f9"/>
-                          <a:stretch>
-                            <a:fillRect/>
-                          </a:stretch>
-                        </pic:blipFill>
-                        <pic:spPr>
-                          <a:xfrm>
-                            <a:off x="0" y="0"/>
-                            <a:ext cx="1778000" cy="703288"/>
-                          </a:xfrm>
-                          <a:prstGeom prst="rect">
-                            <a:avLst/>
-                          </a:prstGeom>
-                        </pic:spPr>
-                      </pic:pic>
-                    </a:graphicData>
-                  </a:graphic>
-                </wp:inline>
-              </w:drawing>
+              <w:rPr>
+                <w:sz w:val="18"/>
+                <w:szCs w:val="18"/>
+                <w:u w:val="single"/>
+                <w:lang w:val="nb-NO"/>
+              </w:rPr>
+            </w:pPr>
+            <w:r>
+              <w:rPr>
+                <w:color w:val="FFFFFF"/>
+              </w:rPr>
+              <w:t>{{SIG_</w:t>
+            </w:r>
+            <w:r>
+              <w:rPr>
+                <w:color w:val="FFFFFF"/>
+              </w:rPr>
+              <w:t>REVIEWER</w:t>
+            </w:r>
+            <w:r>
+              <w:rPr>
+                <w:color w:val="FFFFFF"/>
+              </w:rPr>
+              <w:t>}}</w:t>
+            </w:r>
+          </w:p>
+          <w:p>
+            <w:pPr>
+              <w:pStyle w:val="ListParagraph"/>
+              <w:ind w:left="0"/>
+              <w:rPr>
+                <w:b/>
+                <w:bCs/>
+                <w:noProof/>
+                <w:sz w:val="18"/>
+                <w:szCs w:val="18"/>
+                <w:u w:val="single"/>
+                <w:lang w:val="nb-NO"/>
+              </w:rPr>
+            </w:pPr>
+            <w:r>
+              <w:rPr>
+                <w:sz w:val="18"/>
+                <w:szCs w:val="18"/>
+                <w:u w:val="single"/>
+                <w:lang w:val="nb-NO"/>
+              </w:rPr>
+              <w:t>Reed Richard</w:t>
+            </w:r>
+            <w:r>
+              <w:rPr>
+                <w:sz w:val="18"/>
+                <w:szCs w:val="18"/>
+                <w:u w:val="single"/>
+                <w:lang w:val="nb-NO"/>
+              </w:rPr>
+              <w:t/>
+            </w:r>
+            <w:r>
+              <w:rPr>
+                <w:sz w:val="18"/>
+                <w:szCs w:val="18"/>
+                <w:u w:val="single"/>
+                <w:lang w:val="nb-NO"/>
+              </w:rPr>
+              <w:t/>
             </w:r>
           </w:p>
         </w:tc>
@@ -4050,113 +4663,16 @@
           </w:tcPr>
           <w:p>
             <w:pPr>
-              <w:ind w:left="0"/>
-              <w:jc w:val="left"/>
-              <w:spacing w:after="80"/>
-            </w:pPr>
-            <w:r>
-              <w:drawing>
-                <wp:inline distT="0" distB="0" distL="0" distR="0">
-                  <wp:extent cx="1778000" cy="842903"/>
-                  <wp:effectExtent l="0" t="0" r="0" b="0"/>
-                  <wp:docPr id="500" name="signature"/>
-                  <wp:cNvGraphicFramePr>
-                    <a:graphicFrameLocks noChangeAspect="1"/>
-                  </wp:cNvGraphicFramePr>
-                  <a:graphic>
-                    <a:graphicData uri="http://schemas.openxmlformats.org/drawingml/2006/picture">
-                      <pic:pic>
-                        <pic:nvPicPr>
-                          <pic:cNvPr id="0" name="sig.png"/>
-                          <pic:cNvPicPr/>
-                        </pic:nvPicPr>
-                        <pic:blipFill>
-                          <a:blip r:embed="R5c174169e1e543ff"/>
-                          <a:stretch>
-                            <a:fillRect/>
-                          </a:stretch>
-                        </pic:blipFill>
-                        <pic:spPr>
-                          <a:xfrm>
-                            <a:off x="0" y="0"/>
-                            <a:ext cx="1778000" cy="842903"/>
-                          </a:xfrm>
-                          <a:prstGeom prst="rect">
-                            <a:avLst/>
-                          </a:prstGeom>
-                        </pic:spPr>
-                      </pic:pic>
-                    </a:graphicData>
-                  </a:graphic>
-                </wp:inline>
-              </w:drawing>
-            </w:r>
-          </w:p>
-        </w:tc>
-      </w:tr>
-      <w:tr>
-        <w:tc>
-          <w:tcPr>
-            <w:tcW w:w="3096" w:type="dxa"/>
-          </w:tcPr>
-          <w:p>
-            <w:pPr>
               <w:pStyle w:val="ListParagraph"/>
               <w:ind w:left="0"/>
-              <w:rPr>
-                <w:b/>
-                <w:bCs/>
-                <w:noProof/>
-                <w:sz w:val="18"/>
-                <w:szCs w:val="18"/>
-                <w:u w:val="single"/>
-                <w:lang w:val="nb-NO"/>
-              </w:rPr>
-            </w:pPr>
-            <w:r>
-              <w:rPr>
-                <w:sz w:val="18"/>
-                <w:szCs w:val="18"/>
-                <w:u w:val="single"/>
-                <w:lang w:val="nb-NO"/>
-              </w:rPr>
-              <w:t>Bucky Barnes</w:t>
-            </w:r>
-          </w:p>
-        </w:tc>
-        <w:tc>
-          <w:tcPr>
-            <w:tcW w:w="3087" w:type="dxa"/>
-          </w:tcPr>
-          <w:p>
-            <w:pPr>
-              <w:pStyle w:val="ListParagraph"/>
-              <w:ind w:left="0"/>
-              <w:rPr>
-                <w:b/>
-                <w:bCs/>
-                <w:noProof/>
-                <w:sz w:val="18"/>
-                <w:szCs w:val="18"/>
-                <w:u w:val="single"/>
-                <w:lang w:val="nb-NO"/>
-              </w:rPr>
-            </w:pPr>
-            <w:r>
-              <w:rPr>
-                <w:sz w:val="18"/>
-                <w:szCs w:val="18"/>
-                <w:u w:val="single"/>
-                <w:lang w:val="nb-NO"/>
-              </w:rPr>
-              <w:t>Reed Richard</w:t>
-            </w:r>
-          </w:p>
-        </w:tc>
-        <w:tc>
-          <w:tcPr>
-            <w:tcW w:w="3085" w:type="dxa"/>
-          </w:tcPr>
+            </w:pPr>
+            <w:r>
+              <w:rPr>
+                <w:color w:val="FFFFFF"/>
+              </w:rPr>
+              <w:t>{{SIG_PJ}}</w:t>
+            </w:r>
+          </w:p>
           <w:p>
             <w:pPr>
               <w:pStyle w:val="ListParagraph"/>
@@ -4186,216 +4702,18 @@
     </w:tbl>
     <w:p>
       <w:pPr>
+        <w:spacing w:after="160" w:line="278" w:lineRule="auto"/>
         <w:rPr>
           <w:lang w:val="nb-NO"/>
         </w:rPr>
       </w:pPr>
+      <w:r>
+        <w:rPr>
+          <w:lang w:val="nb-NO"/>
+        </w:rPr>
+        <w:br w:type="page"/>
+      </w:r>
     </w:p>
-    <w:p>
-      <w:pPr>
-        <w:spacing w:after="160" w:line="278" w:lineRule="auto"/>
-        <w:rPr>
-          <w:lang w:val="nb-NO"/>
-        </w:rPr>
-      </w:pPr>
-      <w:r>
-        <w:rPr>
-          <w:lang w:val="nb-NO"/>
-        </w:rPr>
-        <w:br w:type="page"/>
-      </w:r>
-    </w:p>
-    <w:p>
-      <w:pPr>
-        <w:rPr>
-          <w:lang w:val="nb-NO"/>
-        </w:rPr>
-      </w:pPr>
-      <w:r>
-        <w:rPr>
-          <w:lang w:val="nb-NO"/>
-        </w:rPr>
-        <w:lastRenderedPageBreak/>
-        <w:t xml:space="preserve">Bukti Foto </w:t>
-      </w:r>
-      <w:r>
-        <w:rPr>
-          <w:lang w:val="nb-NO"/>
-        </w:rPr>
-        <w:t>Peminjaman</w:t>
-      </w:r>
-      <w:r>
-        <w:rPr>
-          <w:lang w:val="nb-NO"/>
-        </w:rPr>
-        <w:t xml:space="preserve"> Barang</w:t>
-      </w:r>
-    </w:p>
-    <w:p>
-      <w:pPr>
-        <w:rPr>
-          <w:lang w:val="nb-NO"/>
-        </w:rPr>
-      </w:pPr>
-    </w:p>
-    <w:p>
-      <w:pPr>
-        <w:rPr>
-          <w:sz w:val="18"/>
-          <w:szCs w:val="18"/>
-          <w:lang w:val="nb-NO"/>
-        </w:rPr>
-      </w:pPr>
-      <w:r>
-        <w:rPr>
-          <w:sz w:val="18"/>
-          <w:szCs w:val="18"/>
-          <w:lang w:val="nb-NO"/>
-        </w:rPr>
-        <w:t xml:space="preserve">Berita acara peminjaman Mouse, Router, Switch</w:t>
-      </w:r>
-      <w:r>
-        <w:rPr>
-          <w:sz w:val="18"/>
-          <w:szCs w:val="18"/>
-          <w:lang w:val="nb-NO"/>
-        </w:rPr>
-        <w:t/>
-      </w:r>
-      <w:r>
-        <w:rPr>
-          <w:sz w:val="18"/>
-          <w:szCs w:val="18"/>
-          <w:lang w:val="nb-NO"/>
-        </w:rPr>
-        <w:t xml:space="preserve"/>
-      </w:r>
-    </w:p>
-    <w:p>
-      <w:pPr>
-        <w:rPr>
-          <w:noProof/>
-          <w:sz w:val="18"/>
-          <w:szCs w:val="18"/>
-        </w:rPr>
-      </w:pPr>
-      <w:proofErr w:type="spellStart"/>
-      <w:r>
-        <w:rPr>
-          <w:sz w:val="18"/>
-          <w:szCs w:val="18"/>
-        </w:rPr>
-        <w:t>Sesuai dengan Tiket di My SSC No. ABCD1234</w:t>
-      </w:r>
-      <w:proofErr w:type="spellEnd"/>
-      <w:r>
-        <w:rPr>
-          <w:sz w:val="18"/>
-          <w:szCs w:val="18"/>
-        </w:rPr>
-        <w:t xml:space="preserve"/>
-      </w:r>
-      <w:proofErr w:type="spellStart"/>
-      <w:r>
-        <w:rPr>
-          <w:sz w:val="18"/>
-          <w:szCs w:val="18"/>
-        </w:rPr>
-        <w:t/>
-      </w:r>
-      <w:proofErr w:type="spellEnd"/>
-      <w:r>
-        <w:rPr>
-          <w:sz w:val="18"/>
-          <w:szCs w:val="18"/>
-        </w:rPr>
-        <w:t xml:space="preserve"/>
-      </w:r>
-      <w:proofErr w:type="spellStart"/>
-      <w:r>
-        <w:rPr>
-          <w:sz w:val="18"/>
-          <w:szCs w:val="18"/>
-        </w:rPr>
-        <w:t/>
-      </w:r>
-      <w:proofErr w:type="spellEnd"/>
-      <w:r>
-        <w:rPr>
-          <w:sz w:val="18"/>
-          <w:szCs w:val="18"/>
-        </w:rPr>
-        <w:t xml:space="preserve"/>
-      </w:r>
-      <w:r>
-        <w:rPr>
-          <w:noProof/>
-          <w:sz w:val="18"/>
-          <w:szCs w:val="18"/>
-        </w:rPr>
-        <w:t/>
-      </w:r>
-    </w:p>
-    <w:p>
-      <w:pPr>
-        <w:rPr>
-          <w:sz w:val="18"/>
-          <w:szCs w:val="18"/>
-        </w:rPr>
-      </w:pPr>
-      <w:r>
-        <w:rPr>
-          <w:noProof/>
-          <w:sz w:val="18"/>
-          <w:szCs w:val="18"/>
-        </w:rPr>
-        <w:t xml:space="preserve">Romi Aprilian Mustafa - IT Sumbagsel</w:t>
-      </w:r>
-      <w:r>
-        <w:rPr>
-          <w:sz w:val="18"/>
-          <w:szCs w:val="18"/>
-        </w:rPr>
-        <w:t/>
-      </w:r>
-    </w:p>
-    <w:p>
-      <w:pPr>
-        <w:rPr>
-          <w:sz w:val="18"/>
-          <w:szCs w:val="18"/>
-        </w:rPr>
-      </w:pPr>
-      <w:r>
-        <w:rPr>
-          <w:sz w:val="18"/>
-          <w:szCs w:val="18"/>
-        </w:rPr>
-        <w:t>29 Juni 2026</w:t>
-      </w:r>
-    </w:p>
-    <w:p>
-      <w:pPr>
-        <w:rPr>
-          <w:sz w:val="18"/>
-          <w:szCs w:val="18"/>
-        </w:rPr>
-      </w:pPr>
-    </w:p>
-    <w:p>
-      <w:pPr>
-        <w:rPr>
-          <w:sz w:val="18"/>
-          <w:szCs w:val="18"/>
-        </w:rPr>
-      </w:pPr>
-    </w:p>
-    <w:sectPr>
-      <w:pgSz w:w="11906" w:h="16838" w:code="9"/>
-      <w:pgMar w:top="1134" w:right="1134" w:bottom="1134" w:left="1134" w:header="720" w:footer="720" w:gutter="0"/>
-      <w:cols w:space="720"/>
-      <w:docGrid w:linePitch="360"/>
-    </w:sectPr>
     <w:p>
       <w:pPr>
         <w:jc w:val="center"/>
@@ -4403,9 +4721,9 @@
       <w:r>
         <w:drawing>
           <wp:inline distT="0" distB="0" distL="0" distR="0">
-            <wp:extent cx="3254148" cy="5400000"/>
+            <wp:extent cx="3306214" cy="5486400"/>
             <wp:effectExtent l="0" t="0" r="0" b="0"/>
-            <wp:docPr id="100" name="ba-1-photo-1-1782694224811.png"/>
+            <wp:docPr id="85756" name="ba-1-photo-1-1783233356229.png"/>
             <wp:cNvGraphicFramePr>
               <a:graphicFrameLocks noChangeAspect="1"/>
             </wp:cNvGraphicFramePr>
@@ -4413,11 +4731,11 @@
               <a:graphicData uri="http://schemas.openxmlformats.org/drawingml/2006/picture">
                 <pic:pic>
                   <pic:nvPicPr>
-                    <pic:cNvPr id="100" name="ba-1-photo-1-1782694224811.png"/>
+                    <pic:cNvPr id="85757" name="ba-1-photo-1-1783233356229.png"/>
                     <pic:cNvPicPr/>
                   </pic:nvPicPr>
                   <pic:blipFill>
-                    <a:blip r:embed="Ra3cc169f5329460c"/>
+                    <a:blip r:embed="R0d7a2247bc594528"/>
                     <a:stretch>
                       <a:fillRect/>
                     </a:stretch>
@@ -4425,7 +4743,7 @@
                   <pic:spPr>
                     <a:xfrm>
                       <a:off x="0" y="0"/>
-                      <a:ext cx="3254148" cy="5400000"/>
+                      <a:ext cx="3306214" cy="5486400"/>
                     </a:xfrm>
                     <a:prstGeom prst="rect">
                       <a:avLst/>
@@ -4438,6 +4756,54 @@
         </w:drawing>
       </w:r>
     </w:p>
+    <w:p>
+      <w:pPr>
+        <w:jc w:val="center"/>
+      </w:pPr>
+      <w:r>
+        <w:drawing>
+          <wp:inline distT="0" distB="0" distL="0" distR="0">
+            <wp:extent cx="5486400" cy="5126355"/>
+            <wp:effectExtent l="0" t="0" r="0" b="0"/>
+            <wp:docPr id="85758" name="ba-1-photo-2-1783233362079.png"/>
+            <wp:cNvGraphicFramePr>
+              <a:graphicFrameLocks noChangeAspect="1"/>
+            </wp:cNvGraphicFramePr>
+            <a:graphic>
+              <a:graphicData uri="http://schemas.openxmlformats.org/drawingml/2006/picture">
+                <pic:pic>
+                  <pic:nvPicPr>
+                    <pic:cNvPr id="85759" name="ba-1-photo-2-1783233362079.png"/>
+                    <pic:cNvPicPr/>
+                  </pic:nvPicPr>
+                  <pic:blipFill>
+                    <a:blip r:embed="R3f30e38decde48e8"/>
+                    <a:stretch>
+                      <a:fillRect/>
+                    </a:stretch>
+                  </pic:blipFill>
+                  <pic:spPr>
+                    <a:xfrm>
+                      <a:off x="0" y="0"/>
+                      <a:ext cx="5486400" cy="5126355"/>
+                    </a:xfrm>
+                    <a:prstGeom prst="rect">
+                      <a:avLst/>
+                    </a:prstGeom>
+                  </pic:spPr>
+                </pic:pic>
+              </a:graphicData>
+            </a:graphic>
+          </wp:inline>
+        </w:drawing>
+      </w:r>
+    </w:p>
+    <w:sectPr>
+      <w:pgSz w:w="11906" w:h="16838" w:code="9"/>
+      <w:pgMar w:top="1134" w:right="1134" w:bottom="1134" w:left="1134" w:header="720" w:footer="720" w:gutter="0"/>
+      <w:cols w:space="720"/>
+      <w:docGrid w:linePitch="360"/>
+    </w:sectPr>
   </w:body>
 </w:document>
 </file>
@@ -4445,6 +4811,227 @@
 <file path=word/numbering.xml><?xml version="1.0" encoding="utf-8"?>
 <w:numbering xmlns:wpc="http://schemas.microsoft.com/office/word/2010/wordprocessingCanvas" xmlns:cx="http://schemas.microsoft.com/office/drawing/2014/chartex" xmlns:cx1="http://schemas.microsoft.com/office/drawing/2015/9/8/chartex" xmlns:cx2="http://schemas.microsoft.com/office/drawing/2015/10/21/chartex" xmlns:cx3="http://schemas.microsoft.com/office/drawing/2016/5/9/chartex" xmlns:cx4="http://schemas.microsoft.com/office/drawing/2016/5/10/chartex" xmlns:cx5="http://schemas.microsoft.com/office/drawing/2016/5/11/chartex" xmlns:cx6="http://schemas.microsoft.com/office/drawing/2016/5/12/chartex" xmlns:cx7="http://schemas.microsoft.com/office/drawing/2016/5/13/chartex" xmlns:cx8="http://schemas.microsoft.com/office/drawing/2016/5/14/chartex" xmlns:mc="http://schemas.openxmlformats.org/markup-compatibility/2006" xmlns:aink="http://schemas.microsoft.com/office/drawing/2016/ink" xmlns:am3d="http://schemas.microsoft.com/office/drawing/2017/model3d" xmlns:o="urn:schemas-microsoft-com:office:office" xmlns:oel="http://schemas.microsoft.com/office/2019/extlst" xmlns:r="http://schemas.openxmlformats.org/officeDocument/2006/relationships" xmlns:m="http://schemas.openxmlformats.org/officeDocument/2006/math" xmlns:v="urn:schemas-microsoft-com:vml" xmlns:wp14="http://schemas.microsoft.com/office/word/2010/wordprocessingDrawing" xmlns:wp="http://schemas.openxmlformats.org/drawingml/2006/wordprocessingDrawing" xmlns:w10="urn:schemas-microsoft-com:office:word" xmlns:w="http://schemas.openxmlformats.org/wordprocessingml/2006/main" xmlns:w14="http://schemas.microsoft.com/office/word/2010/wordml" xmlns:w15="http://schemas.microsoft.com/office/word/2012/wordml" xmlns:w16cex="http://schemas.microsoft.com/office/word/2018/wordml/cex" xmlns:w16cid="http://schemas.microsoft.com/office/word/2016/wordml/cid" xmlns:w16="http://schemas.microsoft.com/office/word/2018/wordml" xmlns:w16du="http://schemas.microsoft.com/office/word/2023/wordml/word16du" xmlns:w16sdtdh="http://schemas.microsoft.com/office/word/2020/wordml/sdtdatahash" xmlns:w16sdtfl="http://schemas.microsoft.com/office/word/2024/wordml/sdtformatlock" xmlns:w16se="http://schemas.microsoft.com/office/word/2015/wordml/symex" xmlns:wpg="http://schemas.microsoft.com/office/word/2010/wordprocessingGroup" xmlns:wpi="http://schemas.microsoft.com/office/word/2010/wordprocessingInk" xmlns:wne="http://schemas.microsoft.com/office/word/2006/wordml" xmlns:wps="http://schemas.microsoft.com/office/word/2010/wordprocessingShape" mc:Ignorable="w14 w15 w16se w16cid w16 w16cex w16sdtdh w16sdtfl w16du wp14">
   <w:abstractNum w:abstractNumId="0" w15:restartNumberingAfterBreak="0">
+    <w:nsid w:val="07B846C9"/>
+    <w:multiLevelType w:val="hybridMultilevel"/>
+    <w:tmpl w:val="7B5038A4"/>
+    <w:lvl w:ilvl="0" w:tplc="7390BFB8">
+      <w:start w:val="1"/>
+      <w:numFmt w:val="upperRoman"/>
+      <w:lvlText w:val="%1."/>
+      <w:lvlJc w:val="left"/>
+      <w:pPr>
+        <w:ind w:left="814"/>
+      </w:pPr>
+      <w:rPr>
+        <w:rFonts w:ascii="Arial" w:eastAsia="Arial" w:hAnsi="Arial" w:cs="Arial"/>
+        <w:b/>
+        <w:bCs/>
+        <w:i w:val="0"/>
+        <w:strike w:val="0"/>
+        <w:dstrike w:val="0"/>
+        <w:color w:val="000000"/>
+        <w:sz w:val="20"/>
+        <w:szCs w:val="20"/>
+        <w:u w:val="none" w:color="000000"/>
+        <w:bdr w:val="none" w:sz="0" w:space="0" w:color="auto"/>
+        <w:shd w:val="clear" w:color="auto" w:fill="auto"/>
+        <w:vertAlign w:val="baseline"/>
+      </w:rPr>
+    </w:lvl>
+    <w:lvl w:ilvl="1" w:tplc="987075EC">
+      <w:start w:val="1"/>
+      <w:numFmt w:val="lowerLetter"/>
+      <w:lvlText w:val="%2"/>
+      <w:lvlJc w:val="left"/>
+      <w:pPr>
+        <w:ind w:left="1416"/>
+      </w:pPr>
+      <w:rPr>
+        <w:rFonts w:ascii="Arial" w:eastAsia="Arial" w:hAnsi="Arial" w:cs="Arial"/>
+        <w:b/>
+        <w:bCs/>
+        <w:i w:val="0"/>
+        <w:strike w:val="0"/>
+        <w:dstrike w:val="0"/>
+        <w:color w:val="000000"/>
+        <w:sz w:val="20"/>
+        <w:szCs w:val="20"/>
+        <w:u w:val="none" w:color="000000"/>
+        <w:bdr w:val="none" w:sz="0" w:space="0" w:color="auto"/>
+        <w:shd w:val="clear" w:color="auto" w:fill="auto"/>
+        <w:vertAlign w:val="baseline"/>
+      </w:rPr>
+    </w:lvl>
+    <w:lvl w:ilvl="2" w:tplc="650E2008">
+      <w:start w:val="1"/>
+      <w:numFmt w:val="lowerRoman"/>
+      <w:lvlText w:val="%3"/>
+      <w:lvlJc w:val="left"/>
+      <w:pPr>
+        <w:ind w:left="2136"/>
+      </w:pPr>
+      <w:rPr>
+        <w:rFonts w:ascii="Arial" w:eastAsia="Arial" w:hAnsi="Arial" w:cs="Arial"/>
+        <w:b/>
+        <w:bCs/>
+        <w:i w:val="0"/>
+        <w:strike w:val="0"/>
+        <w:dstrike w:val="0"/>
+        <w:color w:val="000000"/>
+        <w:sz w:val="20"/>
+        <w:szCs w:val="20"/>
+        <w:u w:val="none" w:color="000000"/>
+        <w:bdr w:val="none" w:sz="0" w:space="0" w:color="auto"/>
+        <w:shd w:val="clear" w:color="auto" w:fill="auto"/>
+        <w:vertAlign w:val="baseline"/>
+      </w:rPr>
+    </w:lvl>
+    <w:lvl w:ilvl="3" w:tplc="4C40BB4C">
+      <w:start w:val="1"/>
+      <w:numFmt w:val="decimal"/>
+      <w:lvlText w:val="%4"/>
+      <w:lvlJc w:val="left"/>
+      <w:pPr>
+        <w:ind w:left="2856"/>
+      </w:pPr>
+      <w:rPr>
+        <w:rFonts w:ascii="Arial" w:eastAsia="Arial" w:hAnsi="Arial" w:cs="Arial"/>
+        <w:b/>
+        <w:bCs/>
+        <w:i w:val="0"/>
+        <w:strike w:val="0"/>
+        <w:dstrike w:val="0"/>
+        <w:color w:val="000000"/>
+        <w:sz w:val="20"/>
+        <w:szCs w:val="20"/>
+        <w:u w:val="none" w:color="000000"/>
+        <w:bdr w:val="none" w:sz="0" w:space="0" w:color="auto"/>
+        <w:shd w:val="clear" w:color="auto" w:fill="auto"/>
+        <w:vertAlign w:val="baseline"/>
+      </w:rPr>
+    </w:lvl>
+    <w:lvl w:ilvl="4" w:tplc="F266C106">
+      <w:start w:val="1"/>
+      <w:numFmt w:val="lowerLetter"/>
+      <w:lvlText w:val="%5"/>
+      <w:lvlJc w:val="left"/>
+      <w:pPr>
+        <w:ind w:left="3576"/>
+      </w:pPr>
+      <w:rPr>
+        <w:rFonts w:ascii="Arial" w:eastAsia="Arial" w:hAnsi="Arial" w:cs="Arial"/>
+        <w:b/>
+        <w:bCs/>
+        <w:i w:val="0"/>
+        <w:strike w:val="0"/>
+        <w:dstrike w:val="0"/>
+        <w:color w:val="000000"/>
+        <w:sz w:val="20"/>
+        <w:szCs w:val="20"/>
+        <w:u w:val="none" w:color="000000"/>
+        <w:bdr w:val="none" w:sz="0" w:space="0" w:color="auto"/>
+        <w:shd w:val="clear" w:color="auto" w:fill="auto"/>
+        <w:vertAlign w:val="baseline"/>
+      </w:rPr>
+    </w:lvl>
+    <w:lvl w:ilvl="5" w:tplc="A27E6CCA">
+      <w:start w:val="1"/>
+      <w:numFmt w:val="lowerRoman"/>
+      <w:lvlText w:val="%6"/>
+      <w:lvlJc w:val="left"/>
+      <w:pPr>
+        <w:ind w:left="4296"/>
+      </w:pPr>
+      <w:rPr>
+        <w:rFonts w:ascii="Arial" w:eastAsia="Arial" w:hAnsi="Arial" w:cs="Arial"/>
+        <w:b/>
+        <w:bCs/>
+        <w:i w:val="0"/>
+        <w:strike w:val="0"/>
+        <w:dstrike w:val="0"/>
+        <w:color w:val="000000"/>
+        <w:sz w:val="20"/>
+        <w:szCs w:val="20"/>
+        <w:u w:val="none" w:color="000000"/>
+        <w:bdr w:val="none" w:sz="0" w:space="0" w:color="auto"/>
+        <w:shd w:val="clear" w:color="auto" w:fill="auto"/>
+        <w:vertAlign w:val="baseline"/>
+      </w:rPr>
+    </w:lvl>
+    <w:lvl w:ilvl="6" w:tplc="20801AF0">
+      <w:start w:val="1"/>
+      <w:numFmt w:val="decimal"/>
+      <w:lvlText w:val="%7"/>
+      <w:lvlJc w:val="left"/>
+      <w:pPr>
+        <w:ind w:left="5016"/>
+      </w:pPr>
+      <w:rPr>
+        <w:rFonts w:ascii="Arial" w:eastAsia="Arial" w:hAnsi="Arial" w:cs="Arial"/>
+        <w:b/>
+        <w:bCs/>
+        <w:i w:val="0"/>
+        <w:strike w:val="0"/>
+        <w:dstrike w:val="0"/>
+        <w:color w:val="000000"/>
+        <w:sz w:val="20"/>
+        <w:szCs w:val="20"/>
+        <w:u w:val="none" w:color="000000"/>
+        <w:bdr w:val="none" w:sz="0" w:space="0" w:color="auto"/>
+        <w:shd w:val="clear" w:color="auto" w:fill="auto"/>
+        <w:vertAlign w:val="baseline"/>
+      </w:rPr>
+    </w:lvl>
+    <w:lvl w:ilvl="7" w:tplc="C80CF35C">
+      <w:start w:val="1"/>
+      <w:numFmt w:val="lowerLetter"/>
+      <w:lvlText w:val="%8"/>
+      <w:lvlJc w:val="left"/>
+      <w:pPr>
+        <w:ind w:left="5736"/>
+      </w:pPr>
+      <w:rPr>
+        <w:rFonts w:ascii="Arial" w:eastAsia="Arial" w:hAnsi="Arial" w:cs="Arial"/>
+        <w:b/>
+        <w:bCs/>
+        <w:i w:val="0"/>
+        <w:strike w:val="0"/>
+        <w:dstrike w:val="0"/>
+        <w:color w:val="000000"/>
+        <w:sz w:val="20"/>
+        <w:szCs w:val="20"/>
+        <w:u w:val="none" w:color="000000"/>
+        <w:bdr w:val="none" w:sz="0" w:space="0" w:color="auto"/>
+        <w:shd w:val="clear" w:color="auto" w:fill="auto"/>
+        <w:vertAlign w:val="baseline"/>
+      </w:rPr>
+    </w:lvl>
+    <w:lvl w:ilvl="8" w:tplc="B62A0FAE">
+      <w:start w:val="1"/>
+      <w:numFmt w:val="lowerRoman"/>
+      <w:lvlText w:val="%9"/>
+      <w:lvlJc w:val="left"/>
+      <w:pPr>
+        <w:ind w:left="6456"/>
+      </w:pPr>
+      <w:rPr>
+        <w:rFonts w:ascii="Arial" w:eastAsia="Arial" w:hAnsi="Arial" w:cs="Arial"/>
+        <w:b/>
+        <w:bCs/>
+        <w:i w:val="0"/>
+        <w:strike w:val="0"/>
+        <w:dstrike w:val="0"/>
+        <w:color w:val="000000"/>
+        <w:sz w:val="20"/>
+        <w:szCs w:val="20"/>
+        <w:u w:val="none" w:color="000000"/>
+        <w:bdr w:val="none" w:sz="0" w:space="0" w:color="auto"/>
+        <w:shd w:val="clear" w:color="auto" w:fill="auto"/>
+        <w:vertAlign w:val="baseline"/>
+      </w:rPr>
+    </w:lvl>
+  </w:abstractNum>
+  <w:abstractNum w:abstractNumId="1" w15:restartNumberingAfterBreak="0">
     <w:nsid w:val="23720D96"/>
     <w:multiLevelType w:val="hybridMultilevel"/>
     <w:tmpl w:val="AF82BDEC"/>
@@ -4531,6 +5118,9 @@
     </w:lvl>
   </w:abstractNum>
   <w:num w:numId="1" w16cid:durableId="222570238">
+    <w:abstractNumId w:val="1"/>
+  </w:num>
+  <w:num w:numId="2" w16cid:durableId="846092921">
     <w:abstractNumId w:val="0"/>
   </w:num>
 </w:numbering>

</xml_diff>